<commit_message>
Apply Billing rewrite §3.2-3.6 to FASD manual
- §3.2 H2019 HQ row: 156-unit cap, in-person only, no group+individual same day
- §3.3 (new): Intern Service Codes table, payor split by program (Non-Payor for OPMH/FASD, school grant for SBMH)
- §3.4: Z-code framing sentence added above existing bullets
- §3.5: removed Sarasota inline bullet; tightened bullet 3 wording
- §3.6 (new): Who Can Bill What moved from §6 Assessments into Billing
- questions.docx: removed 2 resolved questions (BPS/IDA reassessment cycle = anniversary year; group + individual same-day prohibition confirmed)
- Draft annotated with APPLIED markers for steps 1-5 of 13; §3.9 reassessment cycle locked to anniversary year

Co-Authored-By: Claude Opus 4.7 (1M context) <noreply@anthropic.com>
</commit_message>
<xml_diff>
--- a/FASD_Mental_Health_Onboarding_Manual_REVISED.docx
+++ b/FASD_Mental_Health_Onboarding_Manual_REVISED.docx
@@ -365,10 +365,7 @@
     </w:p>
     <w:p>
       <w:r>
-        <w:t xml:space="preserve">In the service codes, can you add Groups, the code is H2019HQ, </w:t>
-      </w:r>
-      <w:r>
-        <w:t>Medicaid reimburses a maximum of 156 quarter-hour units (39 hours) of group therapy services, per recipient, per state fiscal year</w:t>
+        <w:t>In the service codes, can you add Groups, the code is H2019HQ, Medicaid reimburses a maximum of 156 quarter-hour units (39 hours) of group therapy services, per recipient, per state fiscal year</w:t>
       </w:r>
     </w:p>
     <w:p>
@@ -443,10 +440,7 @@
       </w:r>
       <w:proofErr w:type="gramEnd"/>
       <w:r>
-        <w:t>25.00)</w:t>
-      </w:r>
-      <w:r>
-        <w:t>, non-payor service code serves as Consult/Mentor/CCM/ITXXCC</w:t>
+        <w:t>25.00), non-payor service code serves as Consult/Mentor/CCM/ITXXCC</w:t>
       </w:r>
     </w:p>
     <w:p>
@@ -818,43 +812,7 @@
       </w:r>
       <w:proofErr w:type="gramEnd"/>
       <w:r>
-        <w:t xml:space="preserve">. </w:t>
-      </w:r>
-      <w:r>
-        <w:t>The therapist gets 39hrs (156 units) for the fiscal year</w:t>
-      </w:r>
-      <w:r>
-        <w:t xml:space="preserve"> for groups</w:t>
-      </w:r>
-      <w:r>
-        <w:t xml:space="preserve">. </w:t>
-      </w:r>
-      <w:r>
-        <w:t>A client</w:t>
-      </w:r>
-      <w:r>
-        <w:t xml:space="preserve"> cannot be seen twice in a day</w:t>
-      </w:r>
-      <w:r>
-        <w:t>, for example, participating in a group and seeing a client individually</w:t>
-      </w:r>
-      <w:r>
-        <w:t xml:space="preserve">. </w:t>
-      </w:r>
-      <w:r>
-        <w:t>It is required that each</w:t>
-      </w:r>
-      <w:r>
-        <w:t xml:space="preserve"> child in </w:t>
-      </w:r>
-      <w:r>
-        <w:t>the gr</w:t>
-      </w:r>
-      <w:r>
-        <w:t xml:space="preserve">oup must have a note for documentation. </w:t>
-      </w:r>
-      <w:r>
-        <w:t xml:space="preserve"> Groups are only reimbursed in person, not virtually.  </w:t>
+        <w:t xml:space="preserve">. The therapist gets 39hrs (156 units) for the fiscal year for groups. A client cannot be seen twice in a day, for example, participating in a group and seeing a client individually. It is required that each child in the group must have a note for documentation.  Groups are only reimbursed in person, not virtually.  </w:t>
       </w:r>
     </w:p>
     <w:p>
@@ -940,9 +898,149 @@
       </w:r>
     </w:p>
     <w:p>
-      <w:pPr>
-        <w:pStyle w:val="Heading1"/>
-      </w:pPr>
+      <w:r>
+        <w:t>Section X</w:t>
+      </w:r>
+      <w:proofErr w:type="gramStart"/>
+      <w:r>
+        <w:t>:  This</w:t>
+      </w:r>
+      <w:proofErr w:type="gramEnd"/>
+      <w:r>
+        <w:t xml:space="preserve"> is a section for mental health supervisors (not sure the title)</w:t>
+      </w:r>
+    </w:p>
+    <w:p>
+      <w:r>
+        <w:t>Here are some things I want to include</w:t>
+      </w:r>
+      <w:proofErr w:type="gramStart"/>
+      <w:r>
+        <w:t>:  Intranet</w:t>
+      </w:r>
+      <w:proofErr w:type="gramEnd"/>
+      <w:r>
+        <w:t xml:space="preserve"> link for supervisors: </w:t>
+      </w:r>
+      <w:proofErr w:type="gramStart"/>
+      <w:r>
+        <w:t xml:space="preserve"> It a</w:t>
+      </w:r>
+      <w:proofErr w:type="gramEnd"/>
+      <w:r>
+        <w:t xml:space="preserve"> source of great information that will give an overview of the mental health teams and contact information, information about chart reviews the hiring</w:t>
+      </w:r>
+    </w:p>
+    <w:p>
+      <w:hyperlink r:id="rId8" w:history="1">
+        <w:r>
+          <w:rPr>
+            <w:rStyle w:val="Hyperlink"/>
+          </w:rPr>
+          <w:t>https://sites.google.com/thefloridacenter.org/programs/mental-health-services-home/leader-portal</w:t>
+        </w:r>
+      </w:hyperlink>
+    </w:p>
+    <w:p/>
+    <w:p>
+      <w:r>
+        <w:t xml:space="preserve">Expectations:  </w:t>
+      </w:r>
+    </w:p>
+    <w:p/>
+    <w:p>
+      <w:r>
+        <w:t xml:space="preserve">Compliance </w:t>
+      </w:r>
+      <w:proofErr w:type="spellStart"/>
+      <w:r>
+        <w:t>Montioring</w:t>
+      </w:r>
+      <w:proofErr w:type="spellEnd"/>
+      <w:r>
+        <w:t xml:space="preserve">:  </w:t>
+      </w:r>
+      <w:hyperlink r:id="rId9" w:history="1">
+        <w:r>
+          <w:rPr>
+            <w:rStyle w:val="Hyperlink"/>
+          </w:rPr>
+          <w:t>https://docs.google.com/spreadsheets/d/1S3vp0XlTZfZbKKy6j3msC_2Qv_FPJAWG/edit?gid=53724778#gid=53724778</w:t>
+        </w:r>
+      </w:hyperlink>
+    </w:p>
+    <w:p/>
+    <w:p>
+      <w:r>
+        <w:t>How to Transfer cases:</w:t>
+      </w:r>
+    </w:p>
+    <w:p/>
+    <w:p>
+      <w:r>
+        <w:t>Quarterly Supervisor Review</w:t>
+      </w:r>
+      <w:proofErr w:type="gramStart"/>
+      <w:r>
+        <w:t xml:space="preserve">:  </w:t>
+      </w:r>
+      <w:r>
+        <w:t>Bob</w:t>
+      </w:r>
+      <w:proofErr w:type="gramEnd"/>
+      <w:r>
+        <w:t xml:space="preserve"> sends a report, and basically every active client needs to be reviewed by the supervisor at least one time per quarter.  Supervisors should enter notes for areas of guidance that they verbally tell their supervisees as a form of documentation that the conversation occurred (example</w:t>
+      </w:r>
+      <w:proofErr w:type="gramStart"/>
+      <w:r>
+        <w:t>:  Discussed</w:t>
+      </w:r>
+      <w:proofErr w:type="gramEnd"/>
+      <w:r>
+        <w:t xml:space="preserve"> client’s receive self-injurious statements and advised therapist to complete a safety plan with the child and caregivers).</w:t>
+      </w:r>
+    </w:p>
+    <w:p>
+      <w:r>
+        <w:t>MH Audits</w:t>
+      </w:r>
+      <w:proofErr w:type="gramStart"/>
+      <w:r>
+        <w:t>:  MH</w:t>
+      </w:r>
+      <w:proofErr w:type="gramEnd"/>
+      <w:r>
+        <w:t xml:space="preserve"> department does this quarterly.  Assign each program to a quarter and supervisors facilitate with their staff one per </w:t>
+      </w:r>
+      <w:proofErr w:type="gramStart"/>
+      <w:r>
+        <w:t>year (</w:t>
+      </w:r>
+      <w:r>
+        <w:t>(</w:t>
+      </w:r>
+      <w:proofErr w:type="gramEnd"/>
+      <w:r>
+        <w:t>example</w:t>
+      </w:r>
+      <w:proofErr w:type="gramStart"/>
+      <w:r>
+        <w:t>:  Q1</w:t>
+      </w:r>
+      <w:proofErr w:type="gramEnd"/>
+      <w:r>
+        <w:t xml:space="preserve"> is OPMH/ECMHC Sarasota, Q2 OPMH/ECMHC North Port, Q3 SBMH, Q4 FASD/ECC.</w:t>
+      </w:r>
+      <w:r>
+        <w:t>)</w:t>
+      </w:r>
+    </w:p>
+    <w:p>
+      <w:r>
+        <w:t>Collaboration with other programs:  Why is it important</w:t>
+      </w:r>
+    </w:p>
+    <w:p>
       <w:r>
         <w:t xml:space="preserve">1. Welcome and About </w:t>
       </w:r>
@@ -967,6 +1065,12 @@
       </w:r>
       <w:r>
         <w:t xml:space="preserve"> at The Florida Center for Early Childhood. This manual consolidates the core procedures, clinical expectations, and administrative workflows you will need as an intern, new hire, or licensed therapist working with families affected by Fetal Alcohol Spectrum Disorders (FASD) and other neurobehavioral conditions.</w:t>
+      </w:r>
+    </w:p>
+    <w:p>
+      <w:r>
+        <w:lastRenderedPageBreak/>
+        <w:t xml:space="preserve">What do you do if staff </w:t>
       </w:r>
     </w:p>
     <w:p>
@@ -1125,7 +1229,6 @@
         <w:pStyle w:val="Heading2"/>
       </w:pPr>
       <w:r>
-        <w:lastRenderedPageBreak/>
         <w:t>3.2 Service Codes</w:t>
       </w:r>
     </w:p>
@@ -1326,6 +1429,7 @@
                 <w:b/>
                 <w:sz w:val="20"/>
               </w:rPr>
+              <w:lastRenderedPageBreak/>
               <w:t>H0031 (no modifier)</w:t>
             </w:r>
           </w:p>
@@ -1562,7 +1666,7 @@
               <w:rPr>
                 <w:sz w:val="20"/>
               </w:rPr>
-              <w:t>Workflow and same-day-as-individual rule pending – see questions.docx.</w:t>
+              <w:t>Maximum 156 quarter-hour units (39 hours) per recipient per state fiscal year. In-person only — Medicaid does not reimburse telehealth groups. Cannot bill group and individual on the same day.</w:t>
             </w:r>
           </w:p>
         </w:tc>
@@ -1604,14 +1708,7 @@
               <w:rPr>
                 <w:sz w:val="20"/>
               </w:rPr>
-              <w:t xml:space="preserve">40 units (10 hours) per calendar year. Used for tests, inventories, questionnaires, and structured </w:t>
-            </w:r>
-            <w:r>
-              <w:rPr>
-                <w:sz w:val="20"/>
-              </w:rPr>
-              <w:lastRenderedPageBreak/>
-              <w:t>observations to assess the caregiver-child relationship and inform treatment plan development. Not used often because reimbursement is low; clinicians often prefer to incorporate this work into regular billing.</w:t>
+              <w:t>40 units (10 hours) per calendar year. Used for tests, inventories, questionnaires, and structured observations to assess the caregiver-child relationship and inform treatment plan development. Not used often because reimbursement is low; clinicians often prefer to incorporate this work into regular billing.</w:t>
             </w:r>
           </w:p>
         </w:tc>
@@ -1627,7 +1724,6 @@
                 <w:b/>
                 <w:sz w:val="20"/>
               </w:rPr>
-              <w:lastRenderedPageBreak/>
               <w:t>T1027</w:t>
             </w:r>
           </w:p>
@@ -1654,7 +1750,14 @@
               <w:rPr>
                 <w:sz w:val="20"/>
               </w:rPr>
-              <w:t>Minimum bachelor's degree (master's-level clinicians can also perform it). The DAP note must NOT use the word "therapy." If FMF is delivered for the first 60 minutes and T1027 is billed for the time after, the focus of the T1027 portion must be different – parent coaching, not therapy.</w:t>
+              <w:t xml:space="preserve">Minimum bachelor's degree (master's-level clinicians can also perform it). The DAP note must NOT use the word "therapy." If FMF is delivered for the first 60 minutes and T1027 is billed for the time after, the focus of the T1027 </w:t>
+            </w:r>
+            <w:r>
+              <w:rPr>
+                <w:sz w:val="20"/>
+              </w:rPr>
+              <w:lastRenderedPageBreak/>
+              <w:t>portion must be different – parent coaching, not therapy.</w:t>
             </w:r>
           </w:p>
         </w:tc>
@@ -1670,6 +1773,7 @@
                 <w:b/>
                 <w:sz w:val="20"/>
               </w:rPr>
+              <w:lastRenderedPageBreak/>
               <w:t>H2014</w:t>
             </w:r>
           </w:p>
@@ -1872,10 +1976,455 @@
         <w:pStyle w:val="Heading2"/>
       </w:pPr>
       <w:r>
+        <w:t>3.3 Intern Service Codes</w:t>
+      </w:r>
+    </w:p>
+    <w:p>
+      <w:pPr/>
+      <w:r>
+        <w:t>Interns track their work using the codes below. The IN suffix tells the EHR that the service is non-billable, so nothing flows to a payor. Use these codes when assigning a case to an intern. The payor depends on the program: for OPMH and FASD, use Non-Payor (intern, high-copay/deductible cases); for SBMH, the work is logged under the school grant. Even though no real dollars are attached, the same compliance and documentation standards apply — a CFARS, BPS, IDA, treatment plan, or DAP note must be completed to the same standard as the licensed clinician's work.</w:t>
+      </w:r>
+    </w:p>
+    <w:tbl>
+      <w:tblPr>
+        <w:tblStyle w:val="TableGrid"/>
+        <w:tblW w:w="0" w:type="auto"/>
+        <w:tblLook w:val="04A0" w:firstRow="1" w:lastRow="0" w:firstColumn="1" w:lastColumn="0" w:noHBand="0" w:noVBand="1"/>
+      </w:tblPr>
+      <w:tblGrid>
+        <w:gridCol w:w="3116"/>
+        <w:gridCol w:w="3117"/>
+        <w:gridCol w:w="3117"/>
+      </w:tblGrid>
+      <w:tr>
+        <w:tc>
+          <w:tcPr>
+            <w:tcW w:w="3120" w:type="dxa"/>
+            <w:shd w:val="clear" w:color="auto" w:fill="DEEAF6"/>
+          </w:tcPr>
+          <w:p>
+            <w:r>
+              <w:rPr>
+                <w:b/>
+              </w:rPr>
+              <w:t>Code</w:t>
+            </w:r>
+          </w:p>
+        </w:tc>
+        <w:tc>
+          <w:tcPr>
+            <w:tcW w:w="3120" w:type="dxa"/>
+            <w:shd w:val="clear" w:color="auto" w:fill="DEEAF6"/>
+          </w:tcPr>
+          <w:p>
+            <w:r>
+              <w:rPr>
+                <w:b/>
+              </w:rPr>
+              <w:t>Service</w:t>
+            </w:r>
+          </w:p>
+        </w:tc>
+        <w:tc>
+          <w:tcPr>
+            <w:tcW w:w="3120" w:type="dxa"/>
+            <w:shd w:val="clear" w:color="auto" w:fill="DEEAF6"/>
+          </w:tcPr>
+          <w:p>
+            <w:r>
+              <w:rPr>
+                <w:b/>
+              </w:rPr>
+              <w:t>Units (per recipient per state fiscal year)</w:t>
+            </w:r>
+          </w:p>
+        </w:tc>
+      </w:tr>
+      <w:tr>
+        <w:tc>
+          <w:tcPr>
+            <w:tcW w:w="3120" w:type="dxa"/>
+          </w:tcPr>
+          <w:p>
+            <w:r>
+              <w:rPr>
+                <w:b w:val="0"/>
+              </w:rPr>
+              <w:t>NON-PAYOR</w:t>
+            </w:r>
+          </w:p>
+        </w:tc>
+        <w:tc>
+          <w:tcPr>
+            <w:tcW w:w="3120" w:type="dxa"/>
+          </w:tcPr>
+          <w:p>
+            <w:r>
+              <w:rPr>
+                <w:b w:val="0"/>
+              </w:rPr>
+              <w:t>Consult / Mentor / CCM / ITXXCC</w:t>
+            </w:r>
+          </w:p>
+        </w:tc>
+        <w:tc>
+          <w:tcPr>
+            <w:tcW w:w="3120" w:type="dxa"/>
+          </w:tcPr>
+          <w:p>
+            <w:r>
+              <w:rPr>
+                <w:b w:val="0"/>
+              </w:rPr>
+              <w:t>25</w:t>
+            </w:r>
+          </w:p>
+        </w:tc>
+      </w:tr>
+      <w:tr>
+        <w:tc>
+          <w:tcPr>
+            <w:tcW w:w="3120" w:type="dxa"/>
+          </w:tcPr>
+          <w:p>
+            <w:r>
+              <w:rPr>
+                <w:b w:val="0"/>
+              </w:rPr>
+              <w:t>H0031 IN</w:t>
+            </w:r>
+          </w:p>
+        </w:tc>
+        <w:tc>
+          <w:tcPr>
+            <w:tcW w:w="3120" w:type="dxa"/>
+          </w:tcPr>
+          <w:p>
+            <w:r>
+              <w:rPr>
+                <w:b w:val="0"/>
+              </w:rPr>
+              <w:t>CFARS — Limited Functional Assessment</w:t>
+            </w:r>
+          </w:p>
+        </w:tc>
+        <w:tc>
+          <w:tcPr>
+            <w:tcW w:w="3120" w:type="dxa"/>
+          </w:tcPr>
+          <w:p>
+            <w:r>
+              <w:rPr>
+                <w:b w:val="0"/>
+              </w:rPr>
+              <w:t>3</w:t>
+            </w:r>
+          </w:p>
+        </w:tc>
+      </w:tr>
+      <w:tr>
+        <w:tc>
+          <w:tcPr>
+            <w:tcW w:w="3120" w:type="dxa"/>
+          </w:tcPr>
+          <w:p>
+            <w:r>
+              <w:rPr>
+                <w:b w:val="0"/>
+              </w:rPr>
+              <w:t>H0031 HN IN</w:t>
+            </w:r>
+          </w:p>
+        </w:tc>
+        <w:tc>
+          <w:tcPr>
+            <w:tcW w:w="3120" w:type="dxa"/>
+          </w:tcPr>
+          <w:p>
+            <w:r>
+              <w:rPr>
+                <w:b w:val="0"/>
+              </w:rPr>
+              <w:t>PSY (Biopsychosocial Assessment)</w:t>
+            </w:r>
+          </w:p>
+        </w:tc>
+        <w:tc>
+          <w:tcPr>
+            <w:tcW w:w="3120" w:type="dxa"/>
+          </w:tcPr>
+          <w:p>
+            <w:r>
+              <w:rPr>
+                <w:b w:val="0"/>
+              </w:rPr>
+              <w:t>1</w:t>
+            </w:r>
+          </w:p>
+        </w:tc>
+      </w:tr>
+      <w:tr>
+        <w:tc>
+          <w:tcPr>
+            <w:tcW w:w="3120" w:type="dxa"/>
+          </w:tcPr>
+          <w:p>
+            <w:r>
+              <w:rPr>
+                <w:b w:val="0"/>
+              </w:rPr>
+              <w:t>H0031 HO IN</w:t>
+            </w:r>
+          </w:p>
+        </w:tc>
+        <w:tc>
+          <w:tcPr>
+            <w:tcW w:w="3120" w:type="dxa"/>
+          </w:tcPr>
+          <w:p>
+            <w:r>
+              <w:rPr>
+                <w:b w:val="0"/>
+              </w:rPr>
+              <w:t>IDA, new patient</w:t>
+            </w:r>
+          </w:p>
+        </w:tc>
+        <w:tc>
+          <w:tcPr>
+            <w:tcW w:w="3120" w:type="dxa"/>
+          </w:tcPr>
+          <w:p>
+            <w:r>
+              <w:rPr>
+                <w:b w:val="0"/>
+              </w:rPr>
+              <w:t>1</w:t>
+            </w:r>
+          </w:p>
+        </w:tc>
+      </w:tr>
+      <w:tr>
+        <w:tc>
+          <w:tcPr>
+            <w:tcW w:w="3120" w:type="dxa"/>
+          </w:tcPr>
+          <w:p>
+            <w:r>
+              <w:rPr>
+                <w:b w:val="0"/>
+              </w:rPr>
+              <w:t>H0031 TS IN</w:t>
+            </w:r>
+          </w:p>
+        </w:tc>
+        <w:tc>
+          <w:tcPr>
+            <w:tcW w:w="3120" w:type="dxa"/>
+          </w:tcPr>
+          <w:p>
+            <w:r>
+              <w:rPr>
+                <w:b w:val="0"/>
+              </w:rPr>
+              <w:t>IDA, established patient</w:t>
+            </w:r>
+          </w:p>
+        </w:tc>
+        <w:tc>
+          <w:tcPr>
+            <w:tcW w:w="3120" w:type="dxa"/>
+          </w:tcPr>
+          <w:p>
+            <w:r>
+              <w:rPr>
+                <w:b w:val="0"/>
+              </w:rPr>
+              <w:t>1</w:t>
+            </w:r>
+          </w:p>
+        </w:tc>
+      </w:tr>
+      <w:tr>
+        <w:tc>
+          <w:tcPr>
+            <w:tcW w:w="3120" w:type="dxa"/>
+          </w:tcPr>
+          <w:p>
+            <w:r>
+              <w:rPr>
+                <w:b w:val="0"/>
+              </w:rPr>
+              <w:t>H0032 IN</w:t>
+            </w:r>
+          </w:p>
+        </w:tc>
+        <w:tc>
+          <w:tcPr>
+            <w:tcW w:w="3120" w:type="dxa"/>
+          </w:tcPr>
+          <w:p>
+            <w:r>
+              <w:rPr>
+                <w:b w:val="0"/>
+              </w:rPr>
+              <w:t>Master Treatment Plan</w:t>
+            </w:r>
+          </w:p>
+        </w:tc>
+        <w:tc>
+          <w:tcPr>
+            <w:tcW w:w="3120" w:type="dxa"/>
+          </w:tcPr>
+          <w:p>
+            <w:r>
+              <w:rPr>
+                <w:b w:val="0"/>
+              </w:rPr>
+              <w:t>1</w:t>
+            </w:r>
+          </w:p>
+        </w:tc>
+      </w:tr>
+      <w:tr>
+        <w:tc>
+          <w:tcPr>
+            <w:tcW w:w="3120" w:type="dxa"/>
+          </w:tcPr>
+          <w:p>
+            <w:r>
+              <w:rPr>
+                <w:b w:val="0"/>
+              </w:rPr>
+              <w:t>H0032 TS IN</w:t>
+            </w:r>
+          </w:p>
+        </w:tc>
+        <w:tc>
+          <w:tcPr>
+            <w:tcW w:w="3120" w:type="dxa"/>
+          </w:tcPr>
+          <w:p>
+            <w:r>
+              <w:rPr>
+                <w:b w:val="0"/>
+              </w:rPr>
+              <w:t>Treatment Plan Review</w:t>
+            </w:r>
+          </w:p>
+        </w:tc>
+        <w:tc>
+          <w:tcPr>
+            <w:tcW w:w="3120" w:type="dxa"/>
+          </w:tcPr>
+          <w:p>
+            <w:r>
+              <w:rPr>
+                <w:b w:val="0"/>
+              </w:rPr>
+              <w:t>4</w:t>
+            </w:r>
+          </w:p>
+        </w:tc>
+      </w:tr>
+      <w:tr>
+        <w:tc>
+          <w:tcPr>
+            <w:tcW w:w="3120" w:type="dxa"/>
+          </w:tcPr>
+          <w:p>
+            <w:r>
+              <w:rPr>
+                <w:b w:val="0"/>
+              </w:rPr>
+              <w:t>H2019 HR IN</w:t>
+            </w:r>
+          </w:p>
+        </w:tc>
+        <w:tc>
+          <w:tcPr>
+            <w:tcW w:w="3120" w:type="dxa"/>
+          </w:tcPr>
+          <w:p>
+            <w:r>
+              <w:rPr>
+                <w:b w:val="0"/>
+              </w:rPr>
+              <w:t>Individual / Family Therapy</w:t>
+            </w:r>
+          </w:p>
+        </w:tc>
+        <w:tc>
+          <w:tcPr>
+            <w:tcW w:w="3120" w:type="dxa"/>
+          </w:tcPr>
+          <w:p>
+            <w:r>
+              <w:rPr>
+                <w:b w:val="0"/>
+              </w:rPr>
+              <w:t>200</w:t>
+            </w:r>
+          </w:p>
+        </w:tc>
+      </w:tr>
+      <w:tr>
+        <w:tc>
+          <w:tcPr>
+            <w:tcW w:w="3120" w:type="dxa"/>
+          </w:tcPr>
+          <w:p>
+            <w:r>
+              <w:rPr>
+                <w:b w:val="0"/>
+              </w:rPr>
+              <w:t>H2019 HQ IN</w:t>
+            </w:r>
+          </w:p>
+        </w:tc>
+        <w:tc>
+          <w:tcPr>
+            <w:tcW w:w="3120" w:type="dxa"/>
+          </w:tcPr>
+          <w:p>
+            <w:r>
+              <w:rPr>
+                <w:b w:val="0"/>
+              </w:rPr>
+              <w:t>Group Therapy</w:t>
+            </w:r>
+          </w:p>
+        </w:tc>
+        <w:tc>
+          <w:tcPr>
+            <w:tcW w:w="3120" w:type="dxa"/>
+          </w:tcPr>
+          <w:p>
+            <w:r>
+              <w:rPr>
+                <w:b w:val="0"/>
+              </w:rPr>
+              <w:t>156</w:t>
+            </w:r>
+          </w:p>
+        </w:tc>
+      </w:tr>
+    </w:tbl>
+    <w:p>
+      <w:pPr>
+        <w:pStyle w:val="Heading2"/>
+      </w:pPr>
+      <w:r>
         <w:t>3.4 Z Codes</w:t>
       </w:r>
     </w:p>
     <w:p>
+      <w:pPr/>
+      <w:r>
+        <w:t>Z codes are ICD-10 codes that describe a circumstance or relational issue (e.g., parent-child conflict, family disruption) rather than a billable mental-health diagnosis.</w:t>
+      </w:r>
+    </w:p>
+    <w:p>
       <w:pPr>
         <w:pStyle w:val="ListBullet"/>
       </w:pPr>
@@ -1896,7 +2445,6 @@
         <w:pStyle w:val="Heading2"/>
       </w:pPr>
       <w:r>
-        <w:lastRenderedPageBreak/>
         <w:t xml:space="preserve">3.3 </w:t>
       </w:r>
       <w:r>
@@ -1937,15 +2485,54 @@
         <w:pStyle w:val="ListBullet"/>
       </w:pPr>
       <w:r>
-        <w:t>Another option, a clinician can bill all three of the following: ONE PSY or IDA — H0031 HN — 1 unit, ONE TP — H0032 — 1 unit, ONE CFARS — H0031 — 1 unit (Medicaid only; client must be present)</w:t>
-      </w:r>
-    </w:p>
-    <w:p>
-      <w:pPr>
-        <w:pStyle w:val="ListBullet"/>
-      </w:pPr>
-      <w:r>
+        <w:t>Another option: a clinician can bill all three of the following on the same day: ONE PSY (H0031 HN) or IDA (H0031 HO/TS) — 1 unit, ONE TP (H0032) — 1 unit, ONE CFARS (H0031) — 1 unit. Medicaid only; client must be present.</w:t>
+      </w:r>
+    </w:p>
+    <w:p>
+      <w:pPr>
+        <w:pStyle w:val="ListBullet"/>
+      </w:pPr>
+      <w:r>
+        <w:lastRenderedPageBreak/>
         <w:t>Treatment Plan and individual therapy (ITX) can be billed on the same day, but you can only bill the total time the family was with you. Example: 50 minutes total = 1 hour TP (rounded). 1 hour 15 minutes total = 1 hour TP plus a 15-minute DAP note.</w:t>
+      </w:r>
+    </w:p>
+    <w:p>
+      <w:pPr>
+        <w:pStyle w:val="Heading2"/>
+      </w:pPr>
+      <w:r>
+        <w:t>3.6 Who Can Bill What</w:t>
+      </w:r>
+    </w:p>
+    <w:p>
+      <w:pPr/>
+      <w:r>
+        <w:t>Eligibility to bill a service depends on the clinician's credentials and on who was in the room. Apply these rules before billing any service:</w:t>
+      </w:r>
+    </w:p>
+    <w:p>
+      <w:pPr>
+        <w:pStyle w:val="ListBullet"/>
+      </w:pPr>
+      <w:r>
+        <w:t>To bill any service: the therapist must meet with the child and caregiver together. If the child was not present, the service is not billable.</w:t>
+      </w:r>
+    </w:p>
+    <w:p>
+      <w:pPr>
+        <w:pStyle w:val="ListBullet"/>
+      </w:pPr>
+      <w:r>
+        <w:t>To bill an assessment: the diagnosis must be confirmed by a licensed clinical therapist. A bachelor's-level employee or intern can collect the data, but the diagnosis on the bill must be signed off by a licensed clinician.</w:t>
+      </w:r>
+    </w:p>
+    <w:p>
+      <w:pPr>
+        <w:pStyle w:val="ListBullet"/>
+      </w:pPr>
+      <w:r>
+        <w:t>BPS vs. IDA: a bachelor's-level employee or intern can bill a BPS, but cannot bill an IDA. When a non-licensed clinician bills the BPS, a master's-level clinician must complete the Treatment Plan within the 10-day window. If no master's-level therapist is available to pick up the case immediately, we are at risk of falling out of compliance with the Treatment Plan deadline.</w:t>
       </w:r>
     </w:p>
     <w:p>
@@ -1961,27 +2548,6 @@
     <w:p>
       <w:pPr>
         <w:pStyle w:val="ListBullet"/>
-      </w:pPr>
-      <w:proofErr w:type="gramStart"/>
-      <w:r>
-        <w:t>@Claude</w:t>
-      </w:r>
-      <w:proofErr w:type="gramEnd"/>
-      <w:r>
-        <w:t xml:space="preserve">, this can be with </w:t>
-      </w:r>
-      <w:proofErr w:type="gramStart"/>
-      <w:r>
-        <w:t>billing, but</w:t>
-      </w:r>
-      <w:proofErr w:type="gramEnd"/>
-      <w:r>
-        <w:t xml:space="preserve"> need to highlight using other funding beyond Medicaid.  It is used for things that are not covered by insurance.  If a client resides in Sarasota County, one of the billing codes must be G-FETAL ALCOHOL — COUNTY, and the FASD consult/case management must be under that billing code. This is NOT applicable outside Sarasota County.</w:t>
-      </w:r>
-    </w:p>
-    <w:p>
-      <w:pPr>
-        <w:pStyle w:val="ListBullet"/>
         <w:numPr>
           <w:ilvl w:val="0"/>
           <w:numId w:val="0"/>
@@ -2091,7 +2657,6 @@
         <w:pStyle w:val="Heading2"/>
       </w:pPr>
       <w:r>
-        <w:lastRenderedPageBreak/>
         <w:t xml:space="preserve">3.8 </w:t>
       </w:r>
       <w:r>
@@ -2165,7 +2730,7 @@
       <w:r>
         <w:t xml:space="preserve">Parent Advocate sends completed documentation to </w:t>
       </w:r>
-      <w:hyperlink r:id="rId8" w:history="1">
+      <w:hyperlink r:id="rId10" w:history="1">
         <w:r>
           <w:rPr>
             <w:rStyle w:val="Hyperlink"/>
@@ -2226,6 +2791,7 @@
         <w:spacing w:after="160" w:line="259" w:lineRule="auto"/>
       </w:pPr>
       <w:r>
+        <w:lastRenderedPageBreak/>
         <w:t>Ensure client is only open to the FASD Group</w:t>
       </w:r>
     </w:p>
@@ -2349,7 +2915,6 @@
         <w:pStyle w:val="ListBullet"/>
       </w:pPr>
       <w:r>
-        <w:lastRenderedPageBreak/>
         <w:t>Never bill a BSE on the same day as a psychiatric evaluation, biopsychosocial evaluation, or in-depth assessment for the same recipient.</w:t>
       </w:r>
     </w:p>
@@ -2398,6 +2963,7 @@
         <w:pStyle w:val="ListBullet"/>
       </w:pPr>
       <w:r>
+        <w:lastRenderedPageBreak/>
         <w:t>Reimbursement cap: 4 reviews per recipient per state fiscal year. A quarterly or every-4-months cadence (3–4 reviews per year) is compliant.</w:t>
       </w:r>
     </w:p>
@@ -2518,68 +3084,68 @@
         <w:pStyle w:val="Heading2"/>
       </w:pPr>
       <w:r>
+        <w:t>Sources</w:t>
+      </w:r>
+    </w:p>
+    <w:p>
+      <w:pPr>
+        <w:pStyle w:val="ListBullet"/>
+      </w:pPr>
+      <w:r>
+        <w:t>Florida Medicaid Community Behavioral Health Services Coverage and Limitations Handbook — see pages 2-7 (BSE), 2-9 (in-depth assessment), 2-11 (biopsychosocial evaluation), 2-13 through 2-16 (treatment plan and review).</w:t>
+      </w:r>
+    </w:p>
+    <w:p>
+      <w:pPr>
+        <w:pStyle w:val="ListBullet"/>
+      </w:pPr>
+      <w:r>
+        <w:t>Florida Administrative Code Rule 59G-4.028 — Behavioral Health Assessment Services.</w:t>
+      </w:r>
+    </w:p>
+    <w:p>
+      <w:pPr>
+        <w:pStyle w:val="ListBullet"/>
+      </w:pPr>
+      <w:r>
+        <w:t>Florida Medicaid Community Behavioral Health Fee Schedule (current state fiscal year).</w:t>
+      </w:r>
+    </w:p>
+    <w:p>
+      <w:pPr>
+        <w:pStyle w:val="ListBullet"/>
+      </w:pPr>
+      <w:r>
+        <w:t>Companion reference: Florida_Medicaid_Telehealth_Statewide_Service.docx (telehealth scope and managed-care plan footprint, in this folder).</w:t>
+      </w:r>
+    </w:p>
+    <w:p>
+      <w:pPr>
+        <w:spacing w:after="160" w:line="259" w:lineRule="auto"/>
+      </w:pPr>
+    </w:p>
+    <w:p>
+      <w:pPr>
+        <w:pStyle w:val="Heading2"/>
+      </w:pPr>
+      <w:r>
+        <w:t>3.9 What Intake Does Before Reaching the Therapist</w:t>
+      </w:r>
+    </w:p>
+    <w:p>
+      <w:pPr>
+        <w:pStyle w:val="ListBullet"/>
+      </w:pPr>
+      <w:r>
+        <w:t>Consents, pediatric intake, medical document.</w:t>
+      </w:r>
+    </w:p>
+    <w:p>
+      <w:pPr>
+        <w:pStyle w:val="ListBullet"/>
+      </w:pPr>
+      <w:r>
         <w:lastRenderedPageBreak/>
-        <w:t>Sources</w:t>
-      </w:r>
-    </w:p>
-    <w:p>
-      <w:pPr>
-        <w:pStyle w:val="ListBullet"/>
-      </w:pPr>
-      <w:r>
-        <w:t>Florida Medicaid Community Behavioral Health Services Coverage and Limitations Handbook — see pages 2-7 (BSE), 2-9 (in-depth assessment), 2-11 (biopsychosocial evaluation), 2-13 through 2-16 (treatment plan and review).</w:t>
-      </w:r>
-    </w:p>
-    <w:p>
-      <w:pPr>
-        <w:pStyle w:val="ListBullet"/>
-      </w:pPr>
-      <w:r>
-        <w:t>Florida Administrative Code Rule 59G-4.028 — Behavioral Health Assessment Services.</w:t>
-      </w:r>
-    </w:p>
-    <w:p>
-      <w:pPr>
-        <w:pStyle w:val="ListBullet"/>
-      </w:pPr>
-      <w:r>
-        <w:t>Florida Medicaid Community Behavioral Health Fee Schedule (current state fiscal year).</w:t>
-      </w:r>
-    </w:p>
-    <w:p>
-      <w:pPr>
-        <w:pStyle w:val="ListBullet"/>
-      </w:pPr>
-      <w:r>
-        <w:t>Companion reference: Florida_Medicaid_Telehealth_Statewide_Service.docx (telehealth scope and managed-care plan footprint, in this folder).</w:t>
-      </w:r>
-    </w:p>
-    <w:p>
-      <w:pPr>
-        <w:spacing w:after="160" w:line="259" w:lineRule="auto"/>
-      </w:pPr>
-    </w:p>
-    <w:p>
-      <w:pPr>
-        <w:pStyle w:val="Heading2"/>
-      </w:pPr>
-      <w:r>
-        <w:t>3.9 What Intake Does Before Reaching the Therapist</w:t>
-      </w:r>
-    </w:p>
-    <w:p>
-      <w:pPr>
-        <w:pStyle w:val="ListBullet"/>
-      </w:pPr>
-      <w:r>
-        <w:t>Consents, pediatric intake, medical document.</w:t>
-      </w:r>
-    </w:p>
-    <w:p>
-      <w:pPr>
-        <w:pStyle w:val="ListBullet"/>
-      </w:pPr>
-      <w:r>
         <w:t>All primary care providers should receive notice of services. Ensure the release to communicate with the PCP is signed.</w:t>
       </w:r>
     </w:p>
@@ -2716,41 +3282,41 @@
         <w:pStyle w:val="ListBullet"/>
       </w:pPr>
       <w:r>
+        <w:t>Dates on consent forms must match. We are not allowed to treat any client until consents are signed.</w:t>
+      </w:r>
+    </w:p>
+    <w:p>
+      <w:pPr>
+        <w:pStyle w:val="Heading2"/>
+      </w:pPr>
+      <w:r>
+        <w:t>Who You Are as Their Therapist</w:t>
+      </w:r>
+    </w:p>
+    <w:p>
+      <w:r>
+        <w:t>Briefly tell the family who you are: your role, your training, your supervisor, and the fact that you work specifically with families navigating FASD and other brain-based conditions. Families do better when they know the person across from them.</w:t>
+      </w:r>
+    </w:p>
+    <w:p>
+      <w:pPr>
+        <w:pStyle w:val="Heading2"/>
+      </w:pPr>
+      <w:r>
+        <w:t>Limits to Confidentiality: How to Explain Them to Families</w:t>
+      </w:r>
+    </w:p>
+    <w:p>
+      <w:r>
+        <w:t>Keep this simple. Say something like: 'Most of what you share with me stays between us. There are a few situations where the law requires me to share information, even without your permission, because safety comes first.' Then walk through the limits:</w:t>
+      </w:r>
+    </w:p>
+    <w:p>
+      <w:pPr>
+        <w:pStyle w:val="ListBullet"/>
+      </w:pPr>
+      <w:r>
         <w:lastRenderedPageBreak/>
-        <w:t>Dates on consent forms must match. We are not allowed to treat any client until consents are signed.</w:t>
-      </w:r>
-    </w:p>
-    <w:p>
-      <w:pPr>
-        <w:pStyle w:val="Heading2"/>
-      </w:pPr>
-      <w:r>
-        <w:t>Who You Are as Their Therapist</w:t>
-      </w:r>
-    </w:p>
-    <w:p>
-      <w:r>
-        <w:t>Briefly tell the family who you are: your role, your training, your supervisor, and the fact that you work specifically with families navigating FASD and other brain-based conditions. Families do better when they know the person across from them.</w:t>
-      </w:r>
-    </w:p>
-    <w:p>
-      <w:pPr>
-        <w:pStyle w:val="Heading2"/>
-      </w:pPr>
-      <w:r>
-        <w:t>Limits to Confidentiality: How to Explain Them to Families</w:t>
-      </w:r>
-    </w:p>
-    <w:p>
-      <w:r>
-        <w:t>Keep this simple. Say something like: 'Most of what you share with me stays between us. There are a few situations where the law requires me to share information, even without your permission, because safety comes first.' Then walk through the limits:</w:t>
-      </w:r>
-    </w:p>
-    <w:p>
-      <w:pPr>
-        <w:pStyle w:val="ListBullet"/>
-      </w:pPr>
-      <w:r>
         <w:t>Mandated reporting: if I learn that a child or vulnerable adult is being abused, neglected, or exploited, I am required by law to report it.</w:t>
       </w:r>
     </w:p>
@@ -2880,7 +3446,6 @@
         <w:pStyle w:val="ListBullet"/>
       </w:pPr>
       <w:r>
-        <w:lastRenderedPageBreak/>
         <w:t>Block 2 hours. For Medicaid, actual time with child and family may be 1.5 hours; for private insurance, 60 minutes.</w:t>
       </w:r>
     </w:p>
@@ -2971,6 +3536,7 @@
         <w:pStyle w:val="ListBullet"/>
       </w:pPr>
       <w:r>
+        <w:lastRenderedPageBreak/>
         <w:t>Confidentiality and its limits, including parent/child confidentiality, mandated reporting, and when confidentiality can be broken.</w:t>
       </w:r>
     </w:p>
@@ -3145,7 +3711,6 @@
         <w:pStyle w:val="Heading2"/>
       </w:pPr>
       <w:r>
-        <w:lastRenderedPageBreak/>
         <w:t xml:space="preserve">Special Considerations </w:t>
       </w:r>
       <w:r>
@@ -3218,73 +3783,6 @@
         <w:pStyle w:val="Heading2"/>
       </w:pPr>
       <w:r>
-        <w:t>Who Can Bill What</w:t>
-      </w:r>
-    </w:p>
-    <w:p>
-      <w:pPr>
-        <w:pStyle w:val="ListBullet"/>
-      </w:pPr>
-      <w:r>
-        <w:t>The therapist must meet with the child and caregiver together to bill.</w:t>
-      </w:r>
-    </w:p>
-    <w:p>
-      <w:pPr>
-        <w:pStyle w:val="ListBullet"/>
-      </w:pPr>
-      <w:r>
-        <w:t>The diagnosis must be confirmed by a licensed clinical therapist.</w:t>
-      </w:r>
-    </w:p>
-    <w:p>
-      <w:pPr>
-        <w:pStyle w:val="ListBullet"/>
-      </w:pPr>
-      <w:r>
-        <w:t xml:space="preserve">A bachelor's-level employee </w:t>
-      </w:r>
-      <w:r>
-        <w:t xml:space="preserve">(or even a mental health intern) </w:t>
-      </w:r>
-      <w:r>
-        <w:t>can bill BPS but CANNOT bill IDAs.</w:t>
-      </w:r>
-      <w:r>
-        <w:t xml:space="preserve"> If bill a BPS, a master’s level clinician needs to do the treatment plan within the </w:t>
-      </w:r>
-      <w:proofErr w:type="gramStart"/>
-      <w:r>
-        <w:t>10 day</w:t>
-      </w:r>
-      <w:proofErr w:type="gramEnd"/>
-      <w:r>
-        <w:t xml:space="preserve"> window.</w:t>
-      </w:r>
-      <w:r>
-        <w:t xml:space="preserve">  If there is</w:t>
-      </w:r>
-      <w:r>
-        <w:t xml:space="preserve"> not</w:t>
-      </w:r>
-      <w:r>
-        <w:t xml:space="preserve"> a therapist available to take on the client immediately then we run the risk of being out of compliance with our </w:t>
-      </w:r>
-      <w:r>
-        <w:t xml:space="preserve">treatment plan </w:t>
-      </w:r>
-      <w:r>
-        <w:t>date.</w:t>
-      </w:r>
-      <w:r>
-        <w:t xml:space="preserve"> </w:t>
-      </w:r>
-    </w:p>
-    <w:p>
-      <w:pPr>
-        <w:pStyle w:val="Heading2"/>
-      </w:pPr>
-      <w:r>
         <w:t>Before the Assessment</w:t>
       </w:r>
     </w:p>
@@ -3430,7 +3928,6 @@
         <w:ind w:left="720"/>
       </w:pPr>
       <w:r>
-        <w:lastRenderedPageBreak/>
         <w:t xml:space="preserve">Interns </w:t>
       </w:r>
       <w:proofErr w:type="gramStart"/>
@@ -3726,7 +4223,7 @@
       <w:pPr>
         <w:pStyle w:val="ListBullet"/>
       </w:pPr>
-      <w:hyperlink r:id="rId9">
+      <w:hyperlink r:id="rId11">
         <w:r>
           <w:rPr>
             <w:rStyle w:val="Hyperlink"/>
@@ -3740,7 +4237,7 @@
       <w:pPr>
         <w:pStyle w:val="ListBullet"/>
       </w:pPr>
-      <w:hyperlink r:id="rId10">
+      <w:hyperlink r:id="rId12">
         <w:r>
           <w:rPr>
             <w:rStyle w:val="Hyperlink"/>
@@ -3754,7 +4251,7 @@
       <w:pPr>
         <w:pStyle w:val="ListBullet"/>
       </w:pPr>
-      <w:hyperlink r:id="rId11">
+      <w:hyperlink r:id="rId13">
         <w:r>
           <w:rPr>
             <w:rStyle w:val="Hyperlink"/>
@@ -3784,7 +4281,7 @@
       <w:r>
         <w:t xml:space="preserve">Watch: </w:t>
       </w:r>
-      <w:hyperlink r:id="rId12">
+      <w:hyperlink r:id="rId14">
         <w:r>
           <w:rPr>
             <w:rStyle w:val="Hyperlink"/>
@@ -3807,8 +4304,77 @@
         <w:pStyle w:val="Heading1"/>
       </w:pPr>
       <w:r>
+        <w:t>7. Treatment Plans</w:t>
+      </w:r>
+    </w:p>
+    <w:p>
+      <w:pPr>
+        <w:pStyle w:val="Heading2"/>
+      </w:pPr>
+      <w:r>
+        <w:t>Overview and Compliance</w:t>
+      </w:r>
+    </w:p>
+    <w:p>
+      <w:r>
+        <w:t xml:space="preserve">Treatment Plan sessions are required for parents/guardians </w:t>
+      </w:r>
+      <w:proofErr w:type="gramStart"/>
+      <w:r>
+        <w:t>in order for</w:t>
+      </w:r>
+      <w:proofErr w:type="gramEnd"/>
+      <w:r>
+        <w:t xml:space="preserve"> mental health services to take place. </w:t>
+      </w:r>
+    </w:p>
+    <w:p>
+      <w:pPr>
+        <w:pStyle w:val="Heading2"/>
+      </w:pPr>
+      <w:r>
+        <w:t>Treatment Plan Deadline in Practice</w:t>
+      </w:r>
+    </w:p>
+    <w:p>
+      <w:pPr>
+        <w:pStyle w:val="ListBullet"/>
+      </w:pPr>
+      <w:r>
+        <w:t>The Treatment Plan must be completed and reviewed with the caregiver within the 10-calendar-day window.</w:t>
+      </w:r>
+    </w:p>
+    <w:p>
+      <w:pPr>
+        <w:pStyle w:val="ListBullet"/>
+      </w:pPr>
+      <w:r>
+        <w:t>The caregiver's signature does NOT have to be received within the 10-calendar-day window.</w:t>
+      </w:r>
+    </w:p>
+    <w:p>
+      <w:pPr>
+        <w:pStyle w:val="ListBullet"/>
+      </w:pPr>
+      <w:r>
+        <w:t>If the caregiver cancels, reschedules, cancels again, and the TP slips past 10 days, make sure there is a no-show note. That becomes part of the clinical record. No separate memo to chart is needed.</w:t>
+      </w:r>
+    </w:p>
+    <w:p>
+      <w:pPr>
+        <w:pStyle w:val="ListBullet"/>
+      </w:pPr>
+      <w:r>
+        <w:t>Treatment Plan Reviews must be completed every 90 days.</w:t>
+      </w:r>
+    </w:p>
+    <w:p>
+      <w:pPr>
+        <w:pStyle w:val="ListBullet"/>
+      </w:pPr>
+      <w:r>
         <w:lastRenderedPageBreak/>
-        <w:t>7. Treatment Plans</w:t>
+        <w:t>Because the plan is completed quickly, you may have a provisional diagnosis or treatment goal. You can make an addendum or revise at the Treatment Plan Review. Diagnoses can only be changed at Treatment Plan Reviews or Assessments.</w:t>
       </w:r>
     </w:p>
     <w:p>
@@ -3816,20 +4382,146 @@
         <w:pStyle w:val="Heading2"/>
       </w:pPr>
       <w:r>
-        <w:t>Overview and Compliance</w:t>
-      </w:r>
-    </w:p>
-    <w:p>
-      <w:r>
-        <w:t xml:space="preserve">Treatment Plan sessions are required for parents/guardians </w:t>
+        <w:t>Example Timeline</w:t>
+      </w:r>
+      <w:r>
+        <w:t xml:space="preserve">: </w:t>
+      </w:r>
+      <w:r>
+        <w:t xml:space="preserve"> </w:t>
+      </w:r>
+    </w:p>
+    <w:p>
+      <w:pPr>
+        <w:pStyle w:val="ListBullet"/>
+      </w:pPr>
+      <w:r>
+        <w:t>Assessment completed 9/01/25.</w:t>
+      </w:r>
+    </w:p>
+    <w:p>
+      <w:pPr>
+        <w:pStyle w:val="ListBullet"/>
+      </w:pPr>
+      <w:r>
+        <w:t>Next session, Treatment Plan, on 9/08/25.</w:t>
+      </w:r>
+    </w:p>
+    <w:p>
+      <w:pPr>
+        <w:pStyle w:val="ListBullet"/>
+      </w:pPr>
+      <w:r>
+        <w:t>Therapy sessions (DAP notes) can begin any time after 9/08/25.</w:t>
+      </w:r>
+    </w:p>
+    <w:p>
+      <w:pPr>
+        <w:pStyle w:val="ListBullet"/>
+      </w:pPr>
+      <w:r>
+        <w:t>Addendums can change diagnosis or goals if needed.</w:t>
+      </w:r>
+      <w:r>
+        <w:t xml:space="preserve"> </w:t>
+      </w:r>
+    </w:p>
+    <w:p>
+      <w:pPr>
+        <w:pStyle w:val="ListBullet"/>
+      </w:pPr>
+      <w:r>
+        <w:t>Treatment Plan Reviews every 90 days.</w:t>
+      </w:r>
+    </w:p>
+    <w:p>
+      <w:pPr>
+        <w:pStyle w:val="ListBullet"/>
+      </w:pPr>
+      <w:r>
+        <w:t>Treatment planning is a collaborative process including the family, the identified client where appropriate, the clinician, the supervisor, other treating practitioners, and other parties as requested by the family.</w:t>
+      </w:r>
+    </w:p>
+    <w:p>
+      <w:pPr>
+        <w:pStyle w:val="Heading2"/>
+      </w:pPr>
+      <w:r>
+        <w:t>What the Treatment Plan Session Looks Like</w:t>
+      </w:r>
+    </w:p>
+    <w:p>
+      <w:r>
+        <w:t>Before getting into the plan, review the results of the outcome measures and the Neurobehavioral Screener with the caregiver (and possibly the child). Then discuss:</w:t>
+      </w:r>
+    </w:p>
+    <w:p>
+      <w:pPr>
+        <w:pStyle w:val="ListBullet"/>
+      </w:pPr>
+      <w:r>
+        <w:t>What do you hope to get out of treatment?</w:t>
+      </w:r>
+    </w:p>
+    <w:p>
+      <w:pPr>
+        <w:pStyle w:val="ListBullet"/>
+      </w:pPr>
+      <w:r>
+        <w:t>What is the goal for the parent as it relates to the child's behavior?</w:t>
+      </w:r>
+    </w:p>
+    <w:p>
+      <w:pPr>
+        <w:pStyle w:val="ListBullet"/>
+      </w:pPr>
+      <w:r>
+        <w:t>What is the goal for the child?</w:t>
+      </w:r>
+    </w:p>
+    <w:p>
+      <w:pPr>
+        <w:pStyle w:val="ListBullet"/>
+      </w:pPr>
+      <w:r>
+        <w:t>How would the parent feel being engaged in services? How about meeting on a regular schedule?</w:t>
+      </w:r>
+    </w:p>
+    <w:p>
+      <w:pPr>
+        <w:pStyle w:val="ListBullet"/>
+      </w:pPr>
+      <w:r>
+        <w:t>If the child is being seen without the caregiver, how do you create a system to stay in touch with the caregiver?</w:t>
+      </w:r>
+    </w:p>
+    <w:p>
+      <w:pPr>
+        <w:pStyle w:val="ListBullet"/>
+      </w:pPr>
+      <w:r>
+        <w:t xml:space="preserve">Is the plan realistic based on the child's brain-based challenges and where the caregiver </w:t>
       </w:r>
       <w:proofErr w:type="gramStart"/>
       <w:r>
-        <w:t>in order for</w:t>
+        <w:t>is at</w:t>
       </w:r>
       <w:proofErr w:type="gramEnd"/>
       <w:r>
-        <w:t xml:space="preserve"> mental health services to take place. </w:t>
+        <w:t xml:space="preserve"> emotionally and practically?</w:t>
+      </w:r>
+    </w:p>
+    <w:p>
+      <w:pPr>
+        <w:pStyle w:val="ListBullet"/>
+      </w:pPr>
+      <w:r>
+        <w:t>Are there other people needed to meet the goals?</w:t>
+      </w:r>
+    </w:p>
+    <w:p>
+      <w:r>
+        <w:t>After the discussion, write up the plan and have the family sign it in the follow-up session.</w:t>
       </w:r>
     </w:p>
     <w:p>
@@ -3837,47 +4529,31 @@
         <w:pStyle w:val="Heading2"/>
       </w:pPr>
       <w:r>
-        <w:t>Treatment Plan Deadline in Practice</w:t>
-      </w:r>
-    </w:p>
-    <w:p>
-      <w:pPr>
-        <w:pStyle w:val="ListBullet"/>
-      </w:pPr>
-      <w:r>
-        <w:t>The Treatment Plan must be completed and reviewed with the caregiver within the 10-calendar-day window.</w:t>
-      </w:r>
-    </w:p>
-    <w:p>
-      <w:pPr>
-        <w:pStyle w:val="ListBullet"/>
-      </w:pPr>
-      <w:r>
-        <w:t>The caregiver's signature does NOT have to be received within the 10-calendar-day window.</w:t>
-      </w:r>
-    </w:p>
-    <w:p>
-      <w:pPr>
-        <w:pStyle w:val="ListBullet"/>
-      </w:pPr>
-      <w:r>
-        <w:t>If the caregiver cancels, reschedules, cancels again, and the TP slips past 10 days, make sure there is a no-show note. That becomes part of the clinical record. No separate memo to chart is needed.</w:t>
-      </w:r>
-    </w:p>
-    <w:p>
-      <w:pPr>
-        <w:pStyle w:val="ListBullet"/>
-      </w:pPr>
-      <w:r>
-        <w:t>Treatment Plan Reviews must be completed every 90 days.</w:t>
-      </w:r>
-    </w:p>
-    <w:p>
-      <w:pPr>
-        <w:pStyle w:val="ListBullet"/>
-      </w:pPr>
-      <w:r>
-        <w:t>Because the plan is completed quickly, you may have a provisional diagnosis or treatment goal. You can make an addendum or revise at the Treatment Plan Review. Diagnoses can only be changed at Treatment Plan Reviews or Assessments.</w:t>
+        <w:t>Billing Rules for Treatment Plans</w:t>
+      </w:r>
+    </w:p>
+    <w:p>
+      <w:pPr>
+        <w:pStyle w:val="ListBullet"/>
+      </w:pPr>
+      <w:r>
+        <w:t>Treatment Plan and Treatment Plan Review do NOT require the child to be present, but a caregiver must be.</w:t>
+      </w:r>
+    </w:p>
+    <w:p>
+      <w:pPr>
+        <w:pStyle w:val="ListBullet"/>
+      </w:pPr>
+      <w:r>
+        <w:t>The therapist's signature must match the date of service. The parent's signature date does NOT have to match the day you bill it.</w:t>
+      </w:r>
+    </w:p>
+    <w:p>
+      <w:pPr>
+        <w:pStyle w:val="ListBullet"/>
+      </w:pPr>
+      <w:r>
+        <w:t>Billing for the treatment-plan session is based on the actual session. Insurance requires you to provide the service and type it up within the allotted timeframe. If the meeting runs over (say 1.5 hours), you can bill a TP and therapy.</w:t>
       </w:r>
     </w:p>
     <w:p>
@@ -3885,202 +4561,23 @@
         <w:pStyle w:val="Heading2"/>
       </w:pPr>
       <w:r>
-        <w:t>Example Timeline</w:t>
-      </w:r>
-      <w:r>
-        <w:t xml:space="preserve">: </w:t>
-      </w:r>
-      <w:r>
-        <w:t xml:space="preserve"> </w:t>
-      </w:r>
-    </w:p>
-    <w:p>
-      <w:pPr>
-        <w:pStyle w:val="ListBullet"/>
-      </w:pPr>
-      <w:r>
-        <w:t>Assessment completed 9/01/25.</w:t>
-      </w:r>
-    </w:p>
-    <w:p>
-      <w:pPr>
-        <w:pStyle w:val="ListBullet"/>
-      </w:pPr>
-      <w:r>
-        <w:t>Next session, Treatment Plan, on 9/08/25.</w:t>
-      </w:r>
-    </w:p>
-    <w:p>
-      <w:pPr>
-        <w:pStyle w:val="ListBullet"/>
-      </w:pPr>
-      <w:r>
-        <w:t>Therapy sessions (DAP notes) can begin any time after 9/08/25.</w:t>
-      </w:r>
-    </w:p>
-    <w:p>
-      <w:pPr>
-        <w:pStyle w:val="ListBullet"/>
-      </w:pPr>
-      <w:r>
-        <w:t>Addendums can change diagnosis or goals if needed.</w:t>
-      </w:r>
-      <w:r>
-        <w:t xml:space="preserve"> </w:t>
-      </w:r>
-    </w:p>
-    <w:p>
-      <w:pPr>
-        <w:pStyle w:val="ListBullet"/>
-      </w:pPr>
-      <w:r>
-        <w:t>Treatment Plan Reviews every 90 days.</w:t>
-      </w:r>
-    </w:p>
-    <w:p>
-      <w:pPr>
-        <w:pStyle w:val="ListBullet"/>
-      </w:pPr>
-      <w:r>
-        <w:t>Treatment planning is a collaborative process including the family, the identified client where appropriate, the clinician, the supervisor, other treating practitioners, and other parties as requested by the family.</w:t>
-      </w:r>
-    </w:p>
-    <w:p>
-      <w:pPr>
-        <w:pStyle w:val="Heading2"/>
-      </w:pPr>
-      <w:r>
-        <w:t>What the Treatment Plan Session Looks Like</w:t>
-      </w:r>
-    </w:p>
-    <w:p>
-      <w:r>
-        <w:t>Before getting into the plan, review the results of the outcome measures and the Neurobehavioral Screener with the caregiver (and possibly the child). Then discuss:</w:t>
-      </w:r>
-    </w:p>
-    <w:p>
-      <w:pPr>
-        <w:pStyle w:val="ListBullet"/>
-      </w:pPr>
-      <w:r>
-        <w:t>What do you hope to get out of treatment?</w:t>
-      </w:r>
-    </w:p>
-    <w:p>
-      <w:pPr>
-        <w:pStyle w:val="ListBullet"/>
-      </w:pPr>
-      <w:r>
-        <w:t>What is the goal for the parent as it relates to the child's behavior?</w:t>
-      </w:r>
-    </w:p>
-    <w:p>
-      <w:pPr>
-        <w:pStyle w:val="ListBullet"/>
-      </w:pPr>
-      <w:r>
-        <w:t>What is the goal for the child?</w:t>
-      </w:r>
-    </w:p>
-    <w:p>
-      <w:pPr>
-        <w:pStyle w:val="ListBullet"/>
-      </w:pPr>
-      <w:r>
-        <w:t>How would the parent feel being engaged in services? How about meeting on a regular schedule?</w:t>
-      </w:r>
-    </w:p>
-    <w:p>
-      <w:pPr>
-        <w:pStyle w:val="ListBullet"/>
-      </w:pPr>
-      <w:r>
-        <w:t>If the child is being seen without the caregiver, how do you create a system to stay in touch with the caregiver?</w:t>
-      </w:r>
-    </w:p>
-    <w:p>
-      <w:pPr>
-        <w:pStyle w:val="ListBullet"/>
-      </w:pPr>
-      <w:r>
-        <w:t xml:space="preserve">Is the plan realistic based on the child's brain-based challenges and where the caregiver </w:t>
-      </w:r>
-      <w:proofErr w:type="gramStart"/>
-      <w:r>
-        <w:t>is at</w:t>
-      </w:r>
-      <w:proofErr w:type="gramEnd"/>
-      <w:r>
-        <w:t xml:space="preserve"> emotionally and practically?</w:t>
-      </w:r>
-    </w:p>
-    <w:p>
-      <w:pPr>
-        <w:pStyle w:val="ListBullet"/>
-      </w:pPr>
-      <w:r>
-        <w:t>Are there other people needed to meet the goals?</w:t>
-      </w:r>
-    </w:p>
-    <w:p>
+        <w:t>Required Content and Signatures</w:t>
+      </w:r>
+    </w:p>
+    <w:p>
+      <w:pPr>
+        <w:pStyle w:val="ListBullet"/>
+      </w:pPr>
+      <w:r>
+        <w:t>Treatment Plans must be signed by a supervisor and a 'Type 05' person for Medicaid clients.</w:t>
+      </w:r>
+    </w:p>
+    <w:p>
+      <w:pPr>
+        <w:pStyle w:val="ListBullet"/>
+      </w:pPr>
       <w:r>
         <w:lastRenderedPageBreak/>
-        <w:t>After the discussion, write up the plan and have the family sign it in the follow-up session.</w:t>
-      </w:r>
-    </w:p>
-    <w:p>
-      <w:pPr>
-        <w:pStyle w:val="Heading2"/>
-      </w:pPr>
-      <w:r>
-        <w:t>Billing Rules for Treatment Plans</w:t>
-      </w:r>
-    </w:p>
-    <w:p>
-      <w:pPr>
-        <w:pStyle w:val="ListBullet"/>
-      </w:pPr>
-      <w:r>
-        <w:t>Treatment Plan and Treatment Plan Review do NOT require the child to be present, but a caregiver must be.</w:t>
-      </w:r>
-    </w:p>
-    <w:p>
-      <w:pPr>
-        <w:pStyle w:val="ListBullet"/>
-      </w:pPr>
-      <w:r>
-        <w:t>The therapist's signature must match the date of service. The parent's signature date does NOT have to match the day you bill it.</w:t>
-      </w:r>
-    </w:p>
-    <w:p>
-      <w:pPr>
-        <w:pStyle w:val="ListBullet"/>
-      </w:pPr>
-      <w:r>
-        <w:t>Billing for the treatment-plan session is based on the actual session. Insurance requires you to provide the service and type it up within the allotted timeframe. If the meeting runs over (say 1.5 hours), you can bill a TP and therapy.</w:t>
-      </w:r>
-    </w:p>
-    <w:p>
-      <w:pPr>
-        <w:pStyle w:val="Heading2"/>
-      </w:pPr>
-      <w:r>
-        <w:t>Required Content and Signatures</w:t>
-      </w:r>
-    </w:p>
-    <w:p>
-      <w:pPr>
-        <w:pStyle w:val="ListBullet"/>
-      </w:pPr>
-      <w:r>
-        <w:t>Treatment Plans must be signed by a supervisor and a 'Type 05' person for Medicaid clients.</w:t>
-      </w:r>
-    </w:p>
-    <w:p>
-      <w:pPr>
-        <w:pStyle w:val="ListBullet"/>
-      </w:pPr>
-      <w:r>
         <w:t>All services must be listed on the service table of the treatment plan (e.g., add 'Group Therapy' if the child is attending group each week).</w:t>
       </w:r>
     </w:p>
@@ -4238,7 +4735,6 @@
         <w:pStyle w:val="Heading1"/>
       </w:pPr>
       <w:r>
-        <w:lastRenderedPageBreak/>
         <w:t>8. DAP Notes (Progress Notes)</w:t>
       </w:r>
     </w:p>
@@ -4339,6 +4835,7 @@
         <w:pStyle w:val="Heading2"/>
       </w:pPr>
       <w:r>
+        <w:lastRenderedPageBreak/>
         <w:t>Example Documents</w:t>
       </w:r>
     </w:p>
@@ -4346,7 +4843,7 @@
       <w:pPr>
         <w:pStyle w:val="ListBullet"/>
       </w:pPr>
-      <w:hyperlink r:id="rId13" w:history="1">
+      <w:hyperlink r:id="rId15" w:history="1">
         <w:r>
           <w:rPr>
             <w:rStyle w:val="Hyperlink"/>
@@ -4483,56 +4980,290 @@
     </w:p>
     <w:p>
       <w:r>
+        <w:t>Private insurance: you cannot bill 'discharge.' Close the case administratively through FASD-Case Management. If you met with the family for a last session, that session can still be billed as a session.</w:t>
+      </w:r>
+    </w:p>
+    <w:p>
+      <w:pPr>
+        <w:pStyle w:val="Heading2"/>
+      </w:pPr>
+      <w:r>
+        <w:t>Lauris: Closing a Case</w:t>
+      </w:r>
+    </w:p>
+    <w:p>
+      <w:pPr>
+        <w:pStyle w:val="ListBullet"/>
+      </w:pPr>
+      <w:r>
+        <w:t>From the Lauris home screen, click 'add session.'</w:t>
+      </w:r>
+    </w:p>
+    <w:p>
+      <w:pPr>
+        <w:pStyle w:val="ListBullet"/>
+      </w:pPr>
+      <w:r>
+        <w:t xml:space="preserve">Under 'Existing Client,' type the </w:t>
+      </w:r>
+      <w:proofErr w:type="gramStart"/>
+      <w:r>
+        <w:t>client</w:t>
+      </w:r>
+      <w:proofErr w:type="gramEnd"/>
+      <w:r>
+        <w:t xml:space="preserve"> name or ID.</w:t>
+      </w:r>
+    </w:p>
+    <w:p>
+      <w:pPr>
+        <w:pStyle w:val="ListBullet"/>
+      </w:pPr>
+      <w:r>
+        <w:t>In the 'Choose Form' dropdown, select 'Request Forms' and choose 'Open/Close Transfer Request.'</w:t>
+      </w:r>
+    </w:p>
+    <w:p>
+      <w:pPr>
+        <w:pStyle w:val="ListBullet"/>
+      </w:pPr>
+      <w:r>
+        <w:t xml:space="preserve">Fill in the auto-populated form. When complete, select 'Process Form.' </w:t>
+      </w:r>
+    </w:p>
+    <w:p>
+      <w:pPr>
+        <w:pStyle w:val="Heading2"/>
+      </w:pPr>
+      <w:r>
+        <w:t>Lauris: Discharge Plan</w:t>
+      </w:r>
+    </w:p>
+    <w:p>
+      <w:pPr>
+        <w:pStyle w:val="ListBullet"/>
+      </w:pPr>
+      <w:r>
+        <w:t>From the Lauris home screen, click 'add session.'</w:t>
+      </w:r>
+    </w:p>
+    <w:p>
+      <w:pPr>
+        <w:pStyle w:val="ListBullet"/>
+      </w:pPr>
+      <w:r>
+        <w:t xml:space="preserve">Under 'Existing Client,' type the </w:t>
+      </w:r>
+      <w:proofErr w:type="gramStart"/>
+      <w:r>
+        <w:t>client</w:t>
+      </w:r>
+      <w:proofErr w:type="gramEnd"/>
+      <w:r>
+        <w:t xml:space="preserve"> name or ID.</w:t>
+      </w:r>
+    </w:p>
+    <w:p>
+      <w:pPr>
+        <w:pStyle w:val="ListBullet"/>
+      </w:pPr>
+      <w:r>
+        <w:t>In the 'Choose Form' dropdown, select 'Discharge Plan' and click 'continue.'</w:t>
+      </w:r>
+    </w:p>
+    <w:p>
+      <w:pPr>
+        <w:pStyle w:val="ListBullet"/>
+      </w:pPr>
+      <w:r>
+        <w:t>Fill in the auto-populated form and click 'Process Form.'</w:t>
+      </w:r>
+    </w:p>
+    <w:p>
+      <w:pPr>
+        <w:pStyle w:val="Heading2"/>
+      </w:pPr>
+      <w:bookmarkStart w:id="0" w:name="_Hlk228102086"/>
+      <w:r>
         <w:lastRenderedPageBreak/>
-        <w:t>Private insurance: you cannot bill 'discharge.' Close the case administratively through FASD-Case Management. If you met with the family for a last session, that session can still be billed as a session.</w:t>
-      </w:r>
-    </w:p>
+        <w:t>Discharge Workflow</w:t>
+      </w:r>
+    </w:p>
+    <w:p>
+      <w:pPr>
+        <w:pStyle w:val="ListBullet"/>
+      </w:pPr>
+      <w:r>
+        <w:t>MH Therapist completes the Discharge Plan in Lauris.</w:t>
+      </w:r>
+    </w:p>
+    <w:p>
+      <w:pPr>
+        <w:pStyle w:val="ListBullet"/>
+      </w:pPr>
+      <w:r>
+        <w:t>FASD MH Supervisor signs off on the Discharge Plan.</w:t>
+      </w:r>
+    </w:p>
+    <w:p>
+      <w:pPr>
+        <w:pStyle w:val="ListBullet"/>
+      </w:pPr>
+      <w:r>
+        <w:t>FASD MH Supervisor emails Durae Matthews to close/discharge the client in Lauris.</w:t>
+      </w:r>
+    </w:p>
+    <w:bookmarkEnd w:id="0"/>
     <w:p>
       <w:pPr>
         <w:pStyle w:val="Heading2"/>
       </w:pPr>
       <w:r>
-        <w:t>Lauris: Closing a Case</w:t>
-      </w:r>
-    </w:p>
-    <w:p>
-      <w:pPr>
-        <w:pStyle w:val="ListBullet"/>
-      </w:pPr>
-      <w:r>
-        <w:t>From the Lauris home screen, click 'add session.'</w:t>
-      </w:r>
-    </w:p>
-    <w:p>
-      <w:pPr>
-        <w:pStyle w:val="ListBullet"/>
-      </w:pPr>
-      <w:r>
-        <w:t xml:space="preserve">Under 'Existing Client,' type the </w:t>
+        <w:t>Supervision and Case Consultation</w:t>
+      </w:r>
+    </w:p>
+    <w:p>
+      <w:r>
+        <w:t>Clinicians are required to meet with their licensed supervisor weekly for one hour at minimum. Supervisors must be trained in the modalities they supervise.</w:t>
+      </w:r>
+    </w:p>
+    <w:p>
+      <w:pPr>
+        <w:pStyle w:val="Heading2"/>
+      </w:pPr>
+      <w:r>
+        <w:t>12.2 Why Mental Health Therapists Are Considered Medical Providers</w:t>
+      </w:r>
+    </w:p>
+    <w:p>
+      <w:r>
+        <w:t>Mental health treatment is healthcare. Licensed mental health clinicians diagnose mental health conditions, deliver evidence-based treatment, and manage clinical risk. These are medical/clinical services even if they do not involve prescribing medication.</w:t>
+      </w:r>
+    </w:p>
+    <w:p>
+      <w:r>
+        <w:t>We operate under healthcare laws and standards. Therapy is regulated by:</w:t>
+      </w:r>
+    </w:p>
+    <w:p>
+      <w:pPr>
+        <w:pStyle w:val="ListBullet"/>
+      </w:pPr>
+      <w:r>
+        <w:t>State licensing boards</w:t>
+      </w:r>
+    </w:p>
+    <w:p>
+      <w:pPr>
+        <w:pStyle w:val="ListBullet"/>
+      </w:pPr>
+      <w:r>
+        <w:t>Federal laws (HIPAA, CMS guidelines, etc.)</w:t>
+      </w:r>
+    </w:p>
+    <w:p>
+      <w:pPr>
+        <w:pStyle w:val="ListBullet"/>
+      </w:pPr>
+      <w:r>
+        <w:t>Insurance / Medicaid requirements</w:t>
+      </w:r>
+    </w:p>
+    <w:p>
+      <w:r>
+        <w:t>These standards classify mental health clinicians as healthcare providers and hold us to medical-level documentation expectations.</w:t>
+      </w:r>
+    </w:p>
+    <w:p>
+      <w:r>
+        <w:t xml:space="preserve">We provide </w:t>
       </w:r>
       <w:proofErr w:type="gramStart"/>
       <w:r>
-        <w:t>client</w:t>
+        <w:t>billable</w:t>
       </w:r>
       <w:proofErr w:type="gramEnd"/>
       <w:r>
-        <w:t xml:space="preserve"> name or ID.</w:t>
-      </w:r>
-    </w:p>
-    <w:p>
-      <w:pPr>
-        <w:pStyle w:val="ListBullet"/>
-      </w:pPr>
-      <w:r>
-        <w:t>In the 'Choose Form' dropdown, select 'Request Forms' and choose 'Open/Close Transfer Request.'</w:t>
-      </w:r>
-    </w:p>
-    <w:p>
-      <w:pPr>
-        <w:pStyle w:val="ListBullet"/>
-      </w:pPr>
-      <w:r>
-        <w:t xml:space="preserve">Fill in the auto-populated form. When complete, select 'Process Form.' </w:t>
+        <w:t xml:space="preserve"> clinical services. When a therapist bills insurance, they are functioning as a medical provider. Every billable service must be supported by documentation that demonstrates:</w:t>
+      </w:r>
+    </w:p>
+    <w:p>
+      <w:pPr>
+        <w:pStyle w:val="ListBullet"/>
+      </w:pPr>
+      <w:r>
+        <w:t>Clinical necessity</w:t>
+      </w:r>
+    </w:p>
+    <w:p>
+      <w:pPr>
+        <w:pStyle w:val="ListBullet"/>
+      </w:pPr>
+      <w:r>
+        <w:t>Treatment intervention</w:t>
+      </w:r>
+    </w:p>
+    <w:p>
+      <w:pPr>
+        <w:pStyle w:val="ListBullet"/>
+      </w:pPr>
+      <w:r>
+        <w:t>Client progress</w:t>
+      </w:r>
+    </w:p>
+    <w:p>
+      <w:pPr>
+        <w:pStyle w:val="ListBullet"/>
+      </w:pPr>
+      <w:r>
+        <w:t>Medical necessity</w:t>
+      </w:r>
+    </w:p>
+    <w:p>
+      <w:r>
+        <w:t>Without documentation, the service is not legally billable.</w:t>
+      </w:r>
+    </w:p>
+    <w:p>
+      <w:r>
+        <w:t>Our work affects medical and legal outcomes. Therapy notes may be reviewed:</w:t>
+      </w:r>
+    </w:p>
+    <w:p>
+      <w:pPr>
+        <w:pStyle w:val="ListBullet"/>
+      </w:pPr>
+      <w:r>
+        <w:t>In insurance audits</w:t>
+      </w:r>
+    </w:p>
+    <w:p>
+      <w:pPr>
+        <w:pStyle w:val="ListBullet"/>
+      </w:pPr>
+      <w:r>
+        <w:t>During coordination with psychiatrists, primary care, or hospitals</w:t>
+      </w:r>
+    </w:p>
+    <w:p>
+      <w:pPr>
+        <w:pStyle w:val="ListBullet"/>
+      </w:pPr>
+      <w:r>
+        <w:t>In legal or child welfare cases</w:t>
+      </w:r>
+    </w:p>
+    <w:p>
+      <w:pPr>
+        <w:pStyle w:val="ListBullet"/>
+      </w:pPr>
+      <w:r>
+        <w:t>For disability determinations</w:t>
+      </w:r>
+    </w:p>
+    <w:p>
+      <w:r>
+        <w:t>Because our documentation can influence medical decisions and legal actions, it must meet medical standards.</w:t>
       </w:r>
     </w:p>
     <w:p>
@@ -4540,241 +5271,7 @@
         <w:pStyle w:val="Heading2"/>
       </w:pPr>
       <w:r>
-        <w:t>Lauris: Discharge Plan</w:t>
-      </w:r>
-    </w:p>
-    <w:p>
-      <w:pPr>
-        <w:pStyle w:val="ListBullet"/>
-      </w:pPr>
-      <w:r>
-        <w:t>From the Lauris home screen, click 'add session.'</w:t>
-      </w:r>
-    </w:p>
-    <w:p>
-      <w:pPr>
-        <w:pStyle w:val="ListBullet"/>
-      </w:pPr>
-      <w:r>
-        <w:t xml:space="preserve">Under 'Existing Client,' type the </w:t>
-      </w:r>
-      <w:proofErr w:type="gramStart"/>
-      <w:r>
-        <w:t>client</w:t>
-      </w:r>
-      <w:proofErr w:type="gramEnd"/>
-      <w:r>
-        <w:t xml:space="preserve"> name or ID.</w:t>
-      </w:r>
-    </w:p>
-    <w:p>
-      <w:pPr>
-        <w:pStyle w:val="ListBullet"/>
-      </w:pPr>
-      <w:r>
-        <w:t>In the 'Choose Form' dropdown, select 'Discharge Plan' and click 'continue.'</w:t>
-      </w:r>
-    </w:p>
-    <w:p>
-      <w:pPr>
-        <w:pStyle w:val="ListBullet"/>
-      </w:pPr>
-      <w:r>
-        <w:t>Fill in the auto-populated form and click 'Process Form.'</w:t>
-      </w:r>
-    </w:p>
-    <w:p>
-      <w:pPr>
-        <w:pStyle w:val="Heading2"/>
-      </w:pPr>
-      <w:bookmarkStart w:id="0" w:name="_Hlk228102086"/>
-      <w:r>
-        <w:t>Discharge Workflow</w:t>
-      </w:r>
-    </w:p>
-    <w:p>
-      <w:pPr>
-        <w:pStyle w:val="ListBullet"/>
-      </w:pPr>
-      <w:r>
-        <w:t>MH Therapist completes the Discharge Plan in Lauris.</w:t>
-      </w:r>
-    </w:p>
-    <w:p>
-      <w:pPr>
-        <w:pStyle w:val="ListBullet"/>
-      </w:pPr>
-      <w:r>
-        <w:t>FASD MH Supervisor signs off on the Discharge Plan.</w:t>
-      </w:r>
-    </w:p>
-    <w:p>
-      <w:pPr>
-        <w:pStyle w:val="ListBullet"/>
-      </w:pPr>
-      <w:r>
-        <w:t>FASD MH Supervisor emails Durae Matthews to close/discharge the client in Lauris.</w:t>
-      </w:r>
-    </w:p>
-    <w:bookmarkEnd w:id="0"/>
-    <w:p>
-      <w:pPr>
-        <w:pStyle w:val="Heading2"/>
-      </w:pPr>
-      <w:r>
-        <w:t>Supervision and Case Consultation</w:t>
-      </w:r>
-    </w:p>
-    <w:p>
-      <w:r>
-        <w:t>Clinicians are required to meet with their licensed supervisor weekly for one hour at minimum. Supervisors must be trained in the modalities they supervise.</w:t>
-      </w:r>
-    </w:p>
-    <w:p>
-      <w:pPr>
-        <w:pStyle w:val="Heading2"/>
-      </w:pPr>
-      <w:r>
-        <w:t>12.2 Why Mental Health Therapists Are Considered Medical Providers</w:t>
-      </w:r>
-    </w:p>
-    <w:p>
-      <w:r>
-        <w:t>Mental health treatment is healthcare. Licensed mental health clinicians diagnose mental health conditions, deliver evidence-based treatment, and manage clinical risk. These are medical/clinical services even if they do not involve prescribing medication.</w:t>
-      </w:r>
-    </w:p>
-    <w:p>
-      <w:r>
-        <w:t>We operate under healthcare laws and standards. Therapy is regulated by:</w:t>
-      </w:r>
-    </w:p>
-    <w:p>
-      <w:pPr>
-        <w:pStyle w:val="ListBullet"/>
-      </w:pPr>
-      <w:r>
-        <w:t>State licensing boards</w:t>
-      </w:r>
-    </w:p>
-    <w:p>
-      <w:pPr>
-        <w:pStyle w:val="ListBullet"/>
-      </w:pPr>
-      <w:r>
-        <w:t>Federal laws (HIPAA, CMS guidelines, etc.)</w:t>
-      </w:r>
-    </w:p>
-    <w:p>
-      <w:pPr>
-        <w:pStyle w:val="ListBullet"/>
-      </w:pPr>
-      <w:r>
-        <w:t>Insurance / Medicaid requirements</w:t>
-      </w:r>
-    </w:p>
-    <w:p>
-      <w:r>
-        <w:t>These standards classify mental health clinicians as healthcare providers and hold us to medical-level documentation expectations.</w:t>
-      </w:r>
-    </w:p>
-    <w:p>
-      <w:r>
-        <w:t xml:space="preserve">We provide </w:t>
-      </w:r>
-      <w:proofErr w:type="gramStart"/>
-      <w:r>
-        <w:t>billable</w:t>
-      </w:r>
-      <w:proofErr w:type="gramEnd"/>
-      <w:r>
-        <w:t xml:space="preserve"> clinical services. When a therapist bills insurance, they are functioning as a medical provider. Every billable service must be supported by documentation that demonstrates:</w:t>
-      </w:r>
-    </w:p>
-    <w:p>
-      <w:pPr>
-        <w:pStyle w:val="ListBullet"/>
-      </w:pPr>
-      <w:r>
-        <w:t>Clinical necessity</w:t>
-      </w:r>
-    </w:p>
-    <w:p>
-      <w:pPr>
-        <w:pStyle w:val="ListBullet"/>
-      </w:pPr>
-      <w:r>
-        <w:t>Treatment intervention</w:t>
-      </w:r>
-    </w:p>
-    <w:p>
-      <w:pPr>
-        <w:pStyle w:val="ListBullet"/>
-      </w:pPr>
-      <w:r>
         <w:lastRenderedPageBreak/>
-        <w:t>Client progress</w:t>
-      </w:r>
-    </w:p>
-    <w:p>
-      <w:pPr>
-        <w:pStyle w:val="ListBullet"/>
-      </w:pPr>
-      <w:r>
-        <w:t>Medical necessity</w:t>
-      </w:r>
-    </w:p>
-    <w:p>
-      <w:r>
-        <w:t>Without documentation, the service is not legally billable.</w:t>
-      </w:r>
-    </w:p>
-    <w:p>
-      <w:r>
-        <w:t>Our work affects medical and legal outcomes. Therapy notes may be reviewed:</w:t>
-      </w:r>
-    </w:p>
-    <w:p>
-      <w:pPr>
-        <w:pStyle w:val="ListBullet"/>
-      </w:pPr>
-      <w:r>
-        <w:t>In insurance audits</w:t>
-      </w:r>
-    </w:p>
-    <w:p>
-      <w:pPr>
-        <w:pStyle w:val="ListBullet"/>
-      </w:pPr>
-      <w:r>
-        <w:t>During coordination with psychiatrists, primary care, or hospitals</w:t>
-      </w:r>
-    </w:p>
-    <w:p>
-      <w:pPr>
-        <w:pStyle w:val="ListBullet"/>
-      </w:pPr>
-      <w:r>
-        <w:t>In legal or child welfare cases</w:t>
-      </w:r>
-    </w:p>
-    <w:p>
-      <w:pPr>
-        <w:pStyle w:val="ListBullet"/>
-      </w:pPr>
-      <w:r>
-        <w:t>For disability determinations</w:t>
-      </w:r>
-    </w:p>
-    <w:p>
-      <w:r>
-        <w:t>Because our documentation can influence medical decisions and legal actions, it must meet medical standards.</w:t>
-      </w:r>
-    </w:p>
-    <w:p>
-      <w:pPr>
-        <w:pStyle w:val="Heading2"/>
-      </w:pPr>
-      <w:r>
         <w:t>12.3 Why Documentation Is a Requirement of the Job, Not Just a Company Preference</w:t>
       </w:r>
     </w:p>
@@ -4906,16 +5403,108 @@
     </w:p>
     <w:p>
       <w:r>
+        <w:t xml:space="preserve">If productivity concerns persist, you may be asked to take on clients in other programs (for example, outpatient mental health) so that there is enough work to </w:t>
+      </w:r>
+      <w:proofErr w:type="gramStart"/>
+      <w:r>
+        <w:t>fill</w:t>
+      </w:r>
+      <w:proofErr w:type="gramEnd"/>
+      <w:r>
+        <w:t xml:space="preserve"> the expectations of the scheduled work week.</w:t>
+      </w:r>
+    </w:p>
+    <w:p>
+      <w:pPr>
+        <w:pStyle w:val="Heading2"/>
+      </w:pPr>
+      <w:r>
+        <w:t>13.1 Case Transfers and the Transfer Form</w:t>
+      </w:r>
+    </w:p>
+    <w:p>
+      <w:r>
+        <w:t>To improve accuracy when transferring cases, the transfer form must be completed in full each time. When a case is moved from one program to another, Durae needs a fully completed form before the transfer can be processed.</w:t>
+      </w:r>
+    </w:p>
+    <w:p>
+      <w:r>
+        <w:t>A complete transfer form must include:</w:t>
+      </w:r>
+    </w:p>
+    <w:p>
+      <w:pPr>
+        <w:pStyle w:val="ListBullet"/>
+      </w:pPr>
+      <w:r>
+        <w:t>The originating and receiving programs (for example, OPMH to SBMH).</w:t>
+      </w:r>
+    </w:p>
+    <w:p>
+      <w:pPr>
+        <w:pStyle w:val="ListBullet"/>
+      </w:pPr>
+      <w:r>
+        <w:t>Whether the case is being assigned to an intern.</w:t>
+      </w:r>
+    </w:p>
+    <w:p>
+      <w:pPr>
+        <w:pStyle w:val="ListBullet"/>
+      </w:pPr>
+      <w:r>
         <w:lastRenderedPageBreak/>
-        <w:t xml:space="preserve">If productivity concerns persist, you may be asked to take on clients in other programs (for example, outpatient mental health) so that there is enough work to </w:t>
+        <w:t>Which payor will be used.</w:t>
+      </w:r>
+    </w:p>
+    <w:p>
+      <w:pPr>
+        <w:pStyle w:val="ListBullet"/>
+      </w:pPr>
+      <w:r>
+        <w:t xml:space="preserve">Any other </w:t>
       </w:r>
       <w:proofErr w:type="gramStart"/>
       <w:r>
-        <w:t>fill</w:t>
+        <w:t>identifying information</w:t>
       </w:r>
       <w:proofErr w:type="gramEnd"/>
       <w:r>
-        <w:t xml:space="preserve"> the expectations of the scheduled work week.</w:t>
+        <w:t xml:space="preserve"> the form requests.</w:t>
+      </w:r>
+    </w:p>
+    <w:p>
+      <w:r>
+        <w:t xml:space="preserve">If the form is not completed in full, Durae will reject the </w:t>
+      </w:r>
+      <w:proofErr w:type="gramStart"/>
+      <w:r>
+        <w:t>request</w:t>
+      </w:r>
+      <w:proofErr w:type="gramEnd"/>
+      <w:r>
+        <w:t xml:space="preserve"> and the case will not be transferred until all required information has been received. Please do not assume Durae can infer missing details — she has asked that every field be filled out so she knows exactly who </w:t>
+      </w:r>
+      <w:proofErr w:type="gramStart"/>
+      <w:r>
+        <w:t>is who</w:t>
+      </w:r>
+      <w:proofErr w:type="gramEnd"/>
+      <w:r>
+        <w:t>, when to use intern codes, and when to use billable units and the correct payor.</w:t>
+      </w:r>
+    </w:p>
+    <w:p>
+      <w:r>
+        <w:t xml:space="preserve">Reference — original request from Durae (paraphrased from an email dated 3/30): she is asking that parts of the transfer form be treated as required fields, because it is important she be told who is assigned to the case, when intern codes should be used, and when she needs to switch back to billable units / the client’s payor. She stopped </w:t>
+      </w:r>
+      <w:proofErr w:type="gramStart"/>
+      <w:r>
+        <w:t>assuming</w:t>
+      </w:r>
+      <w:proofErr w:type="gramEnd"/>
+      <w:r>
+        <w:t xml:space="preserve"> some time ago and needs the form filled out with as much information as possible.</w:t>
       </w:r>
     </w:p>
     <w:p>
@@ -4923,246 +5512,151 @@
         <w:pStyle w:val="Heading2"/>
       </w:pPr>
       <w:r>
-        <w:t>13.1 Case Transfers and the Transfer Form</w:t>
-      </w:r>
-    </w:p>
-    <w:p>
-      <w:r>
-        <w:t>To improve accuracy when transferring cases, the transfer form must be completed in full each time. When a case is moved from one program to another, Durae needs a fully completed form before the transfer can be processed.</w:t>
-      </w:r>
-    </w:p>
-    <w:p>
-      <w:r>
-        <w:t>A complete transfer form must include:</w:t>
-      </w:r>
-    </w:p>
-    <w:p>
-      <w:pPr>
-        <w:pStyle w:val="ListBullet"/>
-      </w:pPr>
-      <w:r>
-        <w:t>The originating and receiving programs (for example, OPMH to SBMH).</w:t>
-      </w:r>
-    </w:p>
-    <w:p>
-      <w:pPr>
-        <w:pStyle w:val="ListBullet"/>
-      </w:pPr>
-      <w:r>
-        <w:t>Whether the case is being assigned to an intern.</w:t>
-      </w:r>
-    </w:p>
-    <w:p>
-      <w:pPr>
-        <w:pStyle w:val="ListBullet"/>
-      </w:pPr>
-      <w:r>
-        <w:t>Which payor will be used.</w:t>
-      </w:r>
-    </w:p>
-    <w:p>
-      <w:pPr>
-        <w:pStyle w:val="ListBullet"/>
-      </w:pPr>
-      <w:r>
-        <w:t xml:space="preserve">Any other </w:t>
+        <w:t>13.2 Licensed Therapists: CAQH Attestation</w:t>
+      </w:r>
+    </w:p>
+    <w:p>
+      <w:r>
+        <w:t>This subsection applies to licensed therapists only. It does not apply to registered interns.</w:t>
+      </w:r>
+    </w:p>
+    <w:p>
+      <w:r>
+        <w:t>If you are a licensed therapist, you must keep your CAQH profile current:</w:t>
+      </w:r>
+    </w:p>
+    <w:p>
+      <w:pPr>
+        <w:pStyle w:val="ListBullet"/>
+      </w:pPr>
+      <w:r>
+        <w:t>Log in to your CAQH ProView portal at https://proview.caqh.org/login/.</w:t>
+      </w:r>
+    </w:p>
+    <w:p>
+      <w:pPr>
+        <w:pStyle w:val="ListBullet"/>
+      </w:pPr>
+      <w:r>
+        <w:t>Review your information for accuracy and update anything that has changed (including practice location details).</w:t>
+      </w:r>
+    </w:p>
+    <w:p>
+      <w:pPr>
+        <w:pStyle w:val="ListBullet"/>
+      </w:pPr>
+      <w:r>
+        <w:t>Click "</w:t>
+      </w:r>
+      <w:proofErr w:type="spellStart"/>
+      <w:r>
+        <w:t>Reattest</w:t>
+      </w:r>
+      <w:proofErr w:type="spellEnd"/>
+      <w:r>
+        <w:t>" and submit.</w:t>
+      </w:r>
+    </w:p>
+    <w:p>
+      <w:pPr>
+        <w:pStyle w:val="ListBullet"/>
+      </w:pPr>
+      <w:r>
+        <w:t xml:space="preserve">Authorize release of your profile information to the payors who need it (for example, </w:t>
+      </w:r>
+      <w:proofErr w:type="spellStart"/>
+      <w:r>
+        <w:t>Carelon</w:t>
+      </w:r>
+      <w:proofErr w:type="spellEnd"/>
+      <w:r>
+        <w:t xml:space="preserve"> Behavioral Health) so your data appears in their provider directory.</w:t>
+      </w:r>
+    </w:p>
+    <w:p>
+      <w:r>
+        <w:t xml:space="preserve">CAQH will email you every 90 days asking you to </w:t>
+      </w:r>
+      <w:proofErr w:type="spellStart"/>
+      <w:r>
+        <w:t>reattest</w:t>
+      </w:r>
+      <w:proofErr w:type="spellEnd"/>
+      <w:r>
+        <w:t xml:space="preserve">. You must </w:t>
+      </w:r>
+      <w:proofErr w:type="spellStart"/>
+      <w:r>
+        <w:t>reattest</w:t>
+      </w:r>
+      <w:proofErr w:type="spellEnd"/>
+      <w:r>
+        <w:t xml:space="preserve"> before the deadline listed in each reminder email. If you do not, payors such as </w:t>
+      </w:r>
+      <w:proofErr w:type="spellStart"/>
+      <w:r>
+        <w:t>Carelon</w:t>
+      </w:r>
+      <w:proofErr w:type="spellEnd"/>
+      <w:r>
+        <w:t xml:space="preserve"> can remove you from their provider directory, which puts your ability to bill at risk.</w:t>
+      </w:r>
+    </w:p>
+    <w:p>
+      <w:r>
+        <w:t>Why this matters: under the Consolidated Appropriations Act of 2021 and related state rules, payors are required to confirm that provider directory information is accurate on a regular schedule (every 90 days for commercial lines of business; Medicaid/Medicare and other lines follow state guidance). Keeping CAQH up to date is how we meet that requirement.</w:t>
+      </w:r>
+    </w:p>
+    <w:p>
+      <w:r>
+        <w:t xml:space="preserve">If you have questions about CAQH itself, you can contact CAQH directly at </w:t>
       </w:r>
       <w:proofErr w:type="gramStart"/>
       <w:r>
-        <w:t>identifying information</w:t>
+        <w:t>888-599-1771, or</w:t>
       </w:r>
       <w:proofErr w:type="gramEnd"/>
       <w:r>
-        <w:t xml:space="preserve"> the form requests.</w:t>
-      </w:r>
-    </w:p>
-    <w:p>
-      <w:r>
-        <w:t xml:space="preserve">If the form is not completed in full, Durae will reject the </w:t>
+        <w:t xml:space="preserve"> use the chat support at https://proview.caqh.org/PR. If you are not a CAQH participating provider, data can instead be attested through the </w:t>
+      </w:r>
+      <w:proofErr w:type="spellStart"/>
+      <w:r>
+        <w:t>Carelon</w:t>
+      </w:r>
+      <w:proofErr w:type="spellEnd"/>
+      <w:r>
+        <w:t xml:space="preserve"> Behavioral Health Provider Portal at https://providerportal.CarelonBehavioralHealth.com/index.html#/login — log in with your </w:t>
+      </w:r>
+      <w:proofErr w:type="spellStart"/>
+      <w:r>
+        <w:t>ProviderConnect</w:t>
+      </w:r>
+      <w:proofErr w:type="spellEnd"/>
+      <w:r>
+        <w:t xml:space="preserve"> credentials, choose "Update Demographic Information," scroll to the </w:t>
       </w:r>
       <w:proofErr w:type="gramStart"/>
       <w:r>
-        <w:t>request</w:t>
+        <w:t>bottom, choose "Attestation," update data as needed, and click "Save Attestation."</w:t>
       </w:r>
       <w:proofErr w:type="gramEnd"/>
-      <w:r>
-        <w:t xml:space="preserve"> and the case will not be transferred until all required information has been received. Please do not assume Durae can infer missing details — she has asked that every field be filled out so she knows exactly who </w:t>
-      </w:r>
-      <w:proofErr w:type="gramStart"/>
-      <w:r>
-        <w:t>is who</w:t>
-      </w:r>
-      <w:proofErr w:type="gramEnd"/>
-      <w:r>
-        <w:t>, when to use intern codes, and when to use billable units and the correct payor.</w:t>
-      </w:r>
-    </w:p>
-    <w:p>
-      <w:r>
-        <w:t xml:space="preserve">Reference — original request from Durae (paraphrased from an email dated 3/30): she is asking that parts of the transfer form be treated as required fields, because it is important she be told who is assigned to the case, when intern codes should be used, and when she needs to switch back to billable units / the client’s payor. She stopped </w:t>
-      </w:r>
-      <w:proofErr w:type="gramStart"/>
-      <w:r>
-        <w:t>assuming</w:t>
-      </w:r>
-      <w:proofErr w:type="gramEnd"/>
-      <w:r>
-        <w:t xml:space="preserve"> some time ago and needs the form filled out with as much information as possible.</w:t>
-      </w:r>
     </w:p>
     <w:p>
       <w:pPr>
         <w:pStyle w:val="Heading2"/>
       </w:pPr>
       <w:r>
-        <w:t>13.2 Licensed Therapists: CAQH Attestation</w:t>
-      </w:r>
-    </w:p>
-    <w:p>
-      <w:r>
-        <w:t>This subsection applies to licensed therapists only. It does not apply to registered interns.</w:t>
-      </w:r>
-    </w:p>
-    <w:p>
-      <w:r>
-        <w:t>If you are a licensed therapist, you must keep your CAQH profile current:</w:t>
-      </w:r>
-    </w:p>
-    <w:p>
-      <w:pPr>
-        <w:pStyle w:val="ListBullet"/>
-      </w:pPr>
-      <w:r>
-        <w:t>Log in to your CAQH ProView portal at https://proview.caqh.org/login/.</w:t>
-      </w:r>
-    </w:p>
-    <w:p>
-      <w:pPr>
-        <w:pStyle w:val="ListBullet"/>
-      </w:pPr>
-      <w:r>
-        <w:t>Review your information for accuracy and update anything that has changed (including practice location details).</w:t>
-      </w:r>
-    </w:p>
-    <w:p>
-      <w:pPr>
-        <w:pStyle w:val="ListBullet"/>
-      </w:pPr>
-      <w:r>
-        <w:t>Click "</w:t>
-      </w:r>
-      <w:proofErr w:type="spellStart"/>
-      <w:r>
-        <w:t>Reattest</w:t>
-      </w:r>
-      <w:proofErr w:type="spellEnd"/>
-      <w:r>
-        <w:t>" and submit.</w:t>
-      </w:r>
-    </w:p>
-    <w:p>
-      <w:pPr>
-        <w:pStyle w:val="ListBullet"/>
-      </w:pPr>
-      <w:r>
-        <w:t xml:space="preserve">Authorize release of your profile information to the payors who need it (for example, </w:t>
-      </w:r>
-      <w:proofErr w:type="spellStart"/>
-      <w:r>
-        <w:t>Carelon</w:t>
-      </w:r>
-      <w:proofErr w:type="spellEnd"/>
-      <w:r>
-        <w:t xml:space="preserve"> Behavioral Health) so your data appears in their provider directory.</w:t>
-      </w:r>
-    </w:p>
-    <w:p>
-      <w:r>
-        <w:t xml:space="preserve">CAQH will email you every 90 days asking you to </w:t>
-      </w:r>
-      <w:proofErr w:type="spellStart"/>
-      <w:r>
-        <w:t>reattest</w:t>
-      </w:r>
-      <w:proofErr w:type="spellEnd"/>
-      <w:r>
-        <w:t xml:space="preserve">. You must </w:t>
-      </w:r>
-      <w:proofErr w:type="spellStart"/>
-      <w:r>
-        <w:t>reattest</w:t>
-      </w:r>
-      <w:proofErr w:type="spellEnd"/>
-      <w:r>
-        <w:t xml:space="preserve"> before the deadline listed in each reminder email. If you do not, payors such as </w:t>
-      </w:r>
-      <w:proofErr w:type="spellStart"/>
-      <w:r>
-        <w:t>Carelon</w:t>
-      </w:r>
-      <w:proofErr w:type="spellEnd"/>
-      <w:r>
-        <w:t xml:space="preserve"> can remove you from their provider directory, which puts your ability to bill at risk.</w:t>
-      </w:r>
-    </w:p>
-    <w:p>
-      <w:r>
-        <w:t xml:space="preserve">Why this matters: under the Consolidated Appropriations Act of 2021 and related state rules, payors are required to confirm that provider directory information is accurate on a regular schedule (every 90 days </w:t>
-      </w:r>
+        <w:t>13.4 Registered Interns: Logging Supervision Hours for Licensure</w:t>
+      </w:r>
+    </w:p>
+    <w:p>
+      <w:r>
+        <w:t>This subsection applies to registered interns who are accruing therapy and supervision hours toward licensure. It does not apply to licensed therapists.</w:t>
+      </w:r>
+    </w:p>
+    <w:p>
       <w:r>
         <w:lastRenderedPageBreak/>
-        <w:t>for commercial lines of business; Medicaid/Medicare and other lines follow state guidance). Keeping CAQH up to date is how we meet that requirement.</w:t>
-      </w:r>
-    </w:p>
-    <w:p>
-      <w:r>
-        <w:t xml:space="preserve">If you have questions about CAQH itself, you can contact CAQH directly at </w:t>
-      </w:r>
-      <w:proofErr w:type="gramStart"/>
-      <w:r>
-        <w:t>888-599-1771, or</w:t>
-      </w:r>
-      <w:proofErr w:type="gramEnd"/>
-      <w:r>
-        <w:t xml:space="preserve"> use the chat support at https://proview.caqh.org/PR. If you are not a CAQH participating provider, data can instead be attested through the </w:t>
-      </w:r>
-      <w:proofErr w:type="spellStart"/>
-      <w:r>
-        <w:t>Carelon</w:t>
-      </w:r>
-      <w:proofErr w:type="spellEnd"/>
-      <w:r>
-        <w:t xml:space="preserve"> Behavioral Health Provider Portal at https://providerportal.CarelonBehavioralHealth.com/index.html#/login — log in with your </w:t>
-      </w:r>
-      <w:proofErr w:type="spellStart"/>
-      <w:r>
-        <w:t>ProviderConnect</w:t>
-      </w:r>
-      <w:proofErr w:type="spellEnd"/>
-      <w:r>
-        <w:t xml:space="preserve"> credentials, choose "Update Demographic Information," scroll to the </w:t>
-      </w:r>
-      <w:proofErr w:type="gramStart"/>
-      <w:r>
-        <w:t>bottom, choose "Attestation," update data as needed, and click "Save Attestation."</w:t>
-      </w:r>
-      <w:proofErr w:type="gramEnd"/>
-    </w:p>
-    <w:p>
-      <w:pPr>
-        <w:pStyle w:val="Heading2"/>
-      </w:pPr>
-      <w:r>
-        <w:t>13.4 Registered Interns: Logging Supervision Hours for Licensure</w:t>
-      </w:r>
-    </w:p>
-    <w:p>
-      <w:r>
-        <w:t>This subsection applies to registered interns who are accruing therapy and supervision hours toward licensure. It does not apply to licensed therapists.</w:t>
-      </w:r>
-    </w:p>
-    <w:p>
-      <w:r>
         <w:t xml:space="preserve">Each month, registered interns will receive a log of their accrued therapy hours and supervision hours. The log is to be signed by the intern, the intern’s supervisor, and the qualified supervisor (if that person is within the agency). Only actual supervision time should be logged to the supervision service code in Lauris, and the appointment must be marked "complete" in Lauris </w:t>
       </w:r>
       <w:proofErr w:type="gramStart"/>
@@ -5598,7 +6092,7 @@
       <w:pPr>
         <w:pStyle w:val="ListBullet"/>
       </w:pPr>
-      <w:hyperlink r:id="rId14">
+      <w:hyperlink r:id="rId16">
         <w:r>
           <w:rPr>
             <w:rStyle w:val="Hyperlink"/>
@@ -5620,7 +6114,7 @@
       <w:pPr>
         <w:pStyle w:val="ListBullet"/>
       </w:pPr>
-      <w:hyperlink r:id="rId15">
+      <w:hyperlink r:id="rId17">
         <w:r>
           <w:rPr>
             <w:rStyle w:val="Hyperlink"/>
@@ -5634,7 +6128,7 @@
       <w:pPr>
         <w:pStyle w:val="ListBullet"/>
       </w:pPr>
-      <w:hyperlink r:id="rId16">
+      <w:hyperlink r:id="rId18">
         <w:r>
           <w:rPr>
             <w:rStyle w:val="Hyperlink"/>
@@ -5648,7 +6142,7 @@
       <w:pPr>
         <w:pStyle w:val="ListBullet"/>
       </w:pPr>
-      <w:hyperlink r:id="rId17">
+      <w:hyperlink r:id="rId19">
         <w:r>
           <w:rPr>
             <w:rStyle w:val="Hyperlink"/>
@@ -5670,7 +6164,7 @@
       <w:pPr>
         <w:pStyle w:val="ListBullet"/>
       </w:pPr>
-      <w:hyperlink r:id="rId18">
+      <w:hyperlink r:id="rId20">
         <w:r>
           <w:rPr>
             <w:rStyle w:val="Hyperlink"/>
@@ -5684,7 +6178,7 @@
       <w:pPr>
         <w:pStyle w:val="ListBullet"/>
       </w:pPr>
-      <w:hyperlink r:id="rId19">
+      <w:hyperlink r:id="rId21">
         <w:r>
           <w:rPr>
             <w:rStyle w:val="Hyperlink"/>
@@ -5706,7 +6200,7 @@
       <w:pPr>
         <w:pStyle w:val="ListBullet"/>
       </w:pPr>
-      <w:hyperlink r:id="rId20" w:history="1">
+      <w:hyperlink r:id="rId22" w:history="1">
         <w:r>
           <w:rPr>
             <w:rStyle w:val="Hyperlink"/>
@@ -5725,7 +6219,7 @@
       </w:r>
     </w:p>
     <w:p>
-      <w:hyperlink r:id="rId21">
+      <w:hyperlink r:id="rId23">
         <w:r>
           <w:rPr>
             <w:rStyle w:val="Hyperlink"/>
@@ -5742,7 +6236,7 @@
       </w:r>
     </w:p>
     <w:p>
-      <w:hyperlink r:id="rId22">
+      <w:hyperlink r:id="rId24">
         <w:r>
           <w:rPr>
             <w:rStyle w:val="Hyperlink"/>
@@ -5770,7 +6264,7 @@
       <w:pPr>
         <w:pStyle w:val="ListBullet"/>
       </w:pPr>
-      <w:hyperlink r:id="rId23">
+      <w:hyperlink r:id="rId25">
         <w:r>
           <w:rPr>
             <w:rStyle w:val="Hyperlink"/>
@@ -6088,7 +6582,7 @@
       <w:r>
         <w:t xml:space="preserve">Durae Matthews, Authorization Specialist: </w:t>
       </w:r>
-      <w:hyperlink r:id="rId24" w:history="1">
+      <w:hyperlink r:id="rId26" w:history="1">
         <w:r>
           <w:rPr>
             <w:rStyle w:val="Hyperlink"/>

</xml_diff>